<commit_message>
ajout references Excel+correction pdf/docx references
</commit_message>
<xml_diff>
--- a/Papier/Papier.docx
+++ b/Papier/Papier.docx
@@ -698,7 +698,20 @@
         <w:t xml:space="preserve"> </w:t>
       </w:r>
       <w:r>
-        <w:t xml:space="preserve">(Verstraete and Mellet 2024; Verstraete 2024; Vitali-Rosati et al. 2021; Mellet 2020; Vitali-Rosati et al. 2020)</w:t>
+        <w:t xml:space="preserve">(Verstraete and Mellet 2024; Verstraete 2024; Vitali-Rosati et al. 2021; Mellet 2020;</w:t>
+      </w:r>
+      <w:r>
+        <w:t xml:space="preserve"> </w:t>
+      </w:r>
+      <w:r>
+        <w:rPr>
+          <w:b/>
+          <w:bCs/>
+        </w:rPr>
+        <w:t xml:space="preserve">vitali-rosatiEditorializingGreekAnthology2020?</w:t>
+      </w:r>
+      <w:r>
+        <w:t xml:space="preserve">)</w:t>
       </w:r>
       <w:r>
         <w:t xml:space="preserve">. The project was born out of the need to index and render accessible this foundational corpus, which gathers nearly all the known epigrams of ancient Greek literature. From the beginning, the aim was not only to provide access to these texts, but also to experiment with a digital editorial model suited to their fragmentary nature and complex transmission history.</w:t>
@@ -1091,7 +1104,17 @@
         <w:t xml:space="preserve"> </w:t>
       </w:r>
       <w:r>
-        <w:t xml:space="preserve">(1965, II:464–75)</w:t>
+        <w:t xml:space="preserve">(</w:t>
+      </w:r>
+      <w:r>
+        <w:rPr>
+          <w:b/>
+          <w:bCs/>
+        </w:rPr>
+        <w:t xml:space="preserve">gow_greek_1965?</w:t>
+      </w:r>
+      <w:r>
+        <w:t xml:space="preserve">)</w:t>
       </w:r>
       <w:r>
         <w:t xml:space="preserve">, as well as in the Budé edition</w:t>
@@ -1194,7 +1217,7 @@
         <w:t xml:space="preserve"> </w:t>
       </w:r>
       <w:r>
-        <w:t xml:space="preserve">(Waltz 2003, II:142–43)</w:t>
+        <w:t xml:space="preserve">(Waltz 2003, 142–43)</w:t>
       </w:r>
     </w:p>
     <w:p>
@@ -1335,7 +1358,17 @@
         <w:t xml:space="preserve"> </w:t>
       </w:r>
       <w:r>
-        <w:t xml:space="preserve">(1965, II:231)</w:t>
+        <w:t xml:space="preserve">(</w:t>
+      </w:r>
+      <w:r>
+        <w:rPr>
+          <w:b/>
+          <w:bCs/>
+        </w:rPr>
+        <w:t xml:space="preserve">gow_greek_1965?</w:t>
+      </w:r>
+      <w:r>
+        <w:t xml:space="preserve">)</w:t>
       </w:r>
       <w:r>
         <w:t xml:space="preserve"> </w:t>
@@ -1583,7 +1616,20 @@
         <w:t xml:space="preserve"> </w:t>
       </w:r>
       <w:r>
-        <w:t xml:space="preserve">(Waltz 2003, II:141; 1931, III:184; 1960, V:175; 1974, VIII:281; Irigoin and Maltomini 2017, IX:69; Aubreton 1980, XIII:302)</w:t>
+        <w:t xml:space="preserve">(Waltz 2003, 141; 1931, 184; 1960, 175; 1974, 281;</w:t>
+      </w:r>
+      <w:r>
+        <w:t xml:space="preserve"> </w:t>
+      </w:r>
+      <w:r>
+        <w:rPr>
+          <w:b/>
+          <w:bCs/>
+        </w:rPr>
+        <w:t xml:space="preserve">irigoin_anthologie_2017?</w:t>
+      </w:r>
+      <w:r>
+        <w:t xml:space="preserve">; Aubreton 1980, XIII:302)</w:t>
       </w:r>
       <w:r>
         <w:t xml:space="preserve">;</w:t>
@@ -1614,7 +1660,7 @@
         <w:t xml:space="preserve"> </w:t>
       </w:r>
       <w:r>
-        <w:t xml:space="preserve">(Waltz 1960, V:175)</w:t>
+        <w:t xml:space="preserve">(Waltz 1960, 175)</w:t>
       </w:r>
       <w:r>
         <w:t xml:space="preserve">;</w:t>
@@ -1635,7 +1681,7 @@
         <w:t xml:space="preserve"> </w:t>
       </w:r>
       <w:r>
-        <w:t xml:space="preserve">(Waltz 1960, V:175)</w:t>
+        <w:t xml:space="preserve">(Waltz 1960, 175)</w:t>
       </w:r>
       <w:r>
         <w:t xml:space="preserve">;</w:t>
@@ -1656,7 +1702,7 @@
         <w:t xml:space="preserve"> </w:t>
       </w:r>
       <w:r>
-        <w:t xml:space="preserve">(Waltz 1960, V:175; 1974, VIII:281)</w:t>
+        <w:t xml:space="preserve">(Waltz 1960, 175; 1974, 281)</w:t>
       </w:r>
       <w:r>
         <w:t xml:space="preserve">;</w:t>
@@ -1690,7 +1736,20 @@
         <w:t xml:space="preserve"> </w:t>
       </w:r>
       <w:r>
-        <w:t xml:space="preserve">(Waltz 1974, VIII:281; Irigoin and Maltomini 2017, IX:69)</w:t>
+        <w:t xml:space="preserve">(Waltz 1974, 281;</w:t>
+      </w:r>
+      <w:r>
+        <w:t xml:space="preserve"> </w:t>
+      </w:r>
+      <w:r>
+        <w:rPr>
+          <w:b/>
+          <w:bCs/>
+        </w:rPr>
+        <w:t xml:space="preserve">irigoin_anthologie_2017?</w:t>
+      </w:r>
+      <w:r>
+        <w:t xml:space="preserve">)</w:t>
       </w:r>
       <w:r>
         <w:t xml:space="preserve">.</w:t>
@@ -1733,7 +1792,17 @@
         <w:t xml:space="preserve"> </w:t>
       </w:r>
       <w:r>
-        <w:t xml:space="preserve">(1965, II:434–35)</w:t>
+        <w:t xml:space="preserve">(</w:t>
+      </w:r>
+      <w:r>
+        <w:rPr>
+          <w:b/>
+          <w:bCs/>
+        </w:rPr>
+        <w:t xml:space="preserve">gow_greek_1965?</w:t>
+      </w:r>
+      <w:r>
+        <w:t xml:space="preserve">)</w:t>
       </w:r>
     </w:p>
     <w:p>
@@ -2148,7 +2217,7 @@
       </w:r>
     </w:p>
     <w:bookmarkEnd w:id="71"/>
-    <w:bookmarkStart w:id="125" w:name="references"/>
+    <w:bookmarkStart w:id="120" w:name="references"/>
     <w:p>
       <w:pPr>
         <w:pStyle w:val="Heading2"/>
@@ -2157,7 +2226,7 @@
         <w:t xml:space="preserve">References</w:t>
       </w:r>
     </w:p>
-    <w:bookmarkStart w:id="124" w:name="refs"/>
+    <w:bookmarkStart w:id="119" w:name="refs"/>
     <w:bookmarkStart w:id="72" w:name="ref-aubreton_anthologie_1980"/>
     <w:p>
       <w:pPr>
@@ -2174,24 +2243,10 @@
           <w:i/>
           <w:iCs/>
         </w:rPr>
-        <w:t xml:space="preserve">Anthologie Grecque. T.</w:t>
-      </w:r>
-      <w:r>
-        <w:rPr>
-          <w:i/>
-          <w:iCs/>
-        </w:rPr>
-        <w:t xml:space="preserve"> </w:t>
-      </w:r>
-      <w:r>
-        <w:rPr>
-          <w:i/>
-          <w:iCs/>
-        </w:rPr>
-        <w:t xml:space="preserve">XIII</w:t>
-      </w:r>
-      <w:r>
-        <w:t xml:space="preserve">. Vol. XIII. Budé. Paris: Les Belles Lettres.</w:t>
+        <w:t xml:space="preserve">Anthologie Grecque. Tome XIII: Anthologie de Planude</w:t>
+      </w:r>
+      <w:r>
+        <w:t xml:space="preserve">. Vol. XIII. XIII vols. Budé. Paris: Les Belles Lettres.</w:t>
       </w:r>
     </w:p>
     <w:bookmarkEnd w:id="72"/>
@@ -2946,7 +3001,19 @@
         <w:t xml:space="preserve"> </w:t>
       </w:r>
       <w:r>
-        <w:t xml:space="preserve">“Speaking Names, Variant Readings, and Textual Revision in Greek Epigrams.”</w:t>
+        <w:t xml:space="preserve">“Speaking Names, Variant Readings, and Textual Revision in</w:t>
+      </w:r>
+      <w:r>
+        <w:t xml:space="preserve"> </w:t>
+      </w:r>
+      <w:r>
+        <w:t xml:space="preserve">Greek</w:t>
+      </w:r>
+      <w:r>
+        <w:t xml:space="preserve"> </w:t>
+      </w:r>
+      <w:r>
+        <w:t xml:space="preserve">Epigrams.”</w:t>
       </w:r>
       <w:r>
         <w:t xml:space="preserve"> </w:t>
@@ -2959,7 +3026,10 @@
         <w:t xml:space="preserve">Incontri Di Filologia Classica</w:t>
       </w:r>
       <w:r>
-        <w:t xml:space="preserve">. EUT Edizioni Università di Trieste.</w:t>
+        <w:t xml:space="preserve"> </w:t>
+      </w:r>
+      <w:r>
+        <w:t xml:space="preserve">XIX:135–56.</w:t>
       </w:r>
       <w:r>
         <w:t xml:space="preserve"> </w:t>
@@ -2977,157 +3047,856 @@
       </w:r>
     </w:p>
     <w:bookmarkEnd w:id="85"/>
-    <w:bookmarkStart w:id="86" w:name="ref-gow_greek_1965"/>
+    <w:bookmarkStart w:id="86" w:name="ref-levyLintelligenceCollectivePour1994"/>
     <w:p>
       <w:pPr>
         <w:pStyle w:val="Bibliography"/>
       </w:pPr>
       <w:r>
-        <w:t xml:space="preserve">Gow, Andrew Sydenham Farrar, and Denys Lionel Page. 1965.</w:t>
-      </w:r>
-      <w:r>
-        <w:t xml:space="preserve"> </w:t>
-      </w:r>
-      <w:r>
-        <w:rPr>
-          <w:i/>
-          <w:iCs/>
-        </w:rPr>
-        <w:t xml:space="preserve">The Greek Anthology. Hellenistic Epigrams</w:t>
-      </w:r>
-      <w:r>
-        <w:t xml:space="preserve">. Vol. II. Cambridge: University Press.</w:t>
+        <w:t xml:space="preserve">Lévy, Pierre. 1994.</w:t>
+      </w:r>
+      <w:r>
+        <w:t xml:space="preserve"> </w:t>
+      </w:r>
+      <w:r>
+        <w:rPr>
+          <w:i/>
+          <w:iCs/>
+        </w:rPr>
+        <w:t xml:space="preserve">L’intelligence collective : pour une anthropologie du cyberspace</w:t>
+      </w:r>
+      <w:r>
+        <w:t xml:space="preserve">. Paris: La D</w:t>
+      </w:r>
+      <w:r>
+        <w:t xml:space="preserve">é</w:t>
+      </w:r>
+      <w:r>
+        <w:t xml:space="preserve">couverte.</w:t>
       </w:r>
     </w:p>
     <w:bookmarkEnd w:id="86"/>
-    <w:bookmarkStart w:id="87" w:name="ref-irigoin_anthologie_2017"/>
+    <w:bookmarkStart w:id="88" w:name="ref-mellet2020"/>
     <w:p>
       <w:pPr>
         <w:pStyle w:val="Bibliography"/>
       </w:pPr>
       <w:r>
-        <w:t xml:space="preserve">Irigoin, Jean, and Francesca Maltomini. 2017.</w:t>
-      </w:r>
-      <w:r>
-        <w:t xml:space="preserve"> </w:t>
-      </w:r>
-      <w:r>
-        <w:rPr>
-          <w:i/>
-          <w:iCs/>
-        </w:rPr>
-        <w:t xml:space="preserve">Anthologie Grecque. T.</w:t>
-      </w:r>
-      <w:r>
-        <w:rPr>
-          <w:i/>
-          <w:iCs/>
-        </w:rPr>
-        <w:t xml:space="preserve"> </w:t>
-      </w:r>
-      <w:r>
-        <w:rPr>
-          <w:i/>
-          <w:iCs/>
-        </w:rPr>
-        <w:t xml:space="preserve">IX</w:t>
-      </w:r>
-      <w:r>
-        <w:t xml:space="preserve">. Translated by Pierre Laurens. Vol. IX. Budé. Paris: Les Belles Lettres.</w:t>
-      </w:r>
-    </w:p>
-    <w:bookmarkEnd w:id="87"/>
-    <w:bookmarkStart w:id="88" w:name="ref-levyLintelligenceCollectivePour1994"/>
+        <w:t xml:space="preserve">Mellet, Margot. 2020.</w:t>
+      </w:r>
+      <w:r>
+        <w:t xml:space="preserve"> </w:t>
+      </w:r>
+      <w:r>
+        <w:t xml:space="preserve">“Penser le palimpseste numérique. Le projet d’édition numérique collaborative de l’Anthologie palatine.”</w:t>
+      </w:r>
+      <w:r>
+        <w:t xml:space="preserve"> </w:t>
+      </w:r>
+      <w:r>
+        <w:rPr>
+          <w:i/>
+          <w:iCs/>
+        </w:rPr>
+        <w:t xml:space="preserve">Captures</w:t>
+      </w:r>
+      <w:r>
+        <w:t xml:space="preserve"> </w:t>
+      </w:r>
+      <w:r>
+        <w:t xml:space="preserve">5 (1). https://doi.org/</w:t>
+      </w:r>
+      <w:hyperlink r:id="rId87">
+        <w:r>
+          <w:rPr>
+            <w:rStyle w:val="Hyperlink"/>
+          </w:rPr>
+          <w:t xml:space="preserve">https://doi.org/10.7202/1073479ar</w:t>
+        </w:r>
+      </w:hyperlink>
+      <w:r>
+        <w:t xml:space="preserve">.</w:t>
+      </w:r>
+    </w:p>
+    <w:bookmarkEnd w:id="88"/>
+    <w:bookmarkStart w:id="89" w:name="ref-neubertWikidataLinkingHub2017"/>
     <w:p>
       <w:pPr>
         <w:pStyle w:val="Bibliography"/>
       </w:pPr>
       <w:r>
-        <w:t xml:space="preserve">Lévy, Pierre. 1994.</w:t>
-      </w:r>
-      <w:r>
-        <w:t xml:space="preserve"> </w:t>
-      </w:r>
-      <w:r>
-        <w:rPr>
-          <w:i/>
-          <w:iCs/>
-        </w:rPr>
-        <w:t xml:space="preserve">L’intelligence collective : pour une anthropologie du cyberspace</w:t>
-      </w:r>
-      <w:r>
-        <w:t xml:space="preserve">. Paris: La D</w:t>
-      </w:r>
-      <w:r>
+        <w:t xml:space="preserve">Neubert, Joachim. 2017.</w:t>
+      </w:r>
+      <w:r>
+        <w:t xml:space="preserve"> </w:t>
+      </w:r>
+      <w:r>
+        <w:t xml:space="preserve">“Wikidata as a</w:t>
+      </w:r>
+      <w:r>
+        <w:t xml:space="preserve"> </w:t>
+      </w:r>
+      <w:r>
+        <w:t xml:space="preserve">Linking Hub</w:t>
+      </w:r>
+      <w:r>
+        <w:t xml:space="preserve"> </w:t>
+      </w:r>
+      <w:r>
+        <w:t xml:space="preserve">for</w:t>
+      </w:r>
+      <w:r>
+        <w:t xml:space="preserve"> </w:t>
+      </w:r>
+      <w:r>
+        <w:t xml:space="preserve">Knowledge Organization Systems</w:t>
+      </w:r>
+      <w:r>
+        <w:t xml:space="preserve">?</w:t>
+      </w:r>
+      <w:r>
+        <w:t xml:space="preserve"> </w:t>
+      </w:r>
+      <w:r>
+        <w:t xml:space="preserve">Integrating</w:t>
+      </w:r>
+      <w:r>
+        <w:t xml:space="preserve"> </w:t>
+      </w:r>
+      <w:r>
+        <w:t xml:space="preserve">an</w:t>
+      </w:r>
+      <w:r>
+        <w:t xml:space="preserve"> </w:t>
+      </w:r>
+      <w:r>
+        <w:t xml:space="preserve">Authority Mapping</w:t>
+      </w:r>
+      <w:r>
+        <w:t xml:space="preserve"> </w:t>
+      </w:r>
+      <w:r>
+        <w:t xml:space="preserve">into</w:t>
+      </w:r>
+      <w:r>
+        <w:t xml:space="preserve"> </w:t>
+      </w:r>
+      <w:r>
+        <w:t xml:space="preserve">Wikidata</w:t>
+      </w:r>
+      <w:r>
+        <w:t xml:space="preserve"> </w:t>
+      </w:r>
+      <w:r>
+        <w:t xml:space="preserve">and</w:t>
+      </w:r>
+      <w:r>
+        <w:t xml:space="preserve"> </w:t>
+      </w:r>
+      <w:r>
+        <w:t xml:space="preserve">Learning Lessons</w:t>
+      </w:r>
+      <w:r>
+        <w:t xml:space="preserve"> </w:t>
+      </w:r>
+      <w:r>
+        <w:t xml:space="preserve">for</w:t>
+      </w:r>
+      <w:r>
+        <w:t xml:space="preserve"> </w:t>
+      </w:r>
+      <w:r>
+        <w:t xml:space="preserve">KOS Mappings</w:t>
+      </w:r>
+      <w:r>
+        <w:t xml:space="preserve">.”</w:t>
+      </w:r>
+      <w:r>
+        <w:t xml:space="preserve"> </w:t>
+      </w:r>
+      <w:r>
+        <w:t xml:space="preserve">In</w:t>
+      </w:r>
+      <w:r>
+        <w:t xml:space="preserve"> </w:t>
+      </w:r>
+      <w:r>
+        <w:rPr>
+          <w:i/>
+          <w:iCs/>
+        </w:rPr>
+        <w:t xml:space="preserve">Proceedings of the 17th European Networked Knowledge Organization Systems Workshop Co-Located with the 21st International Conference on Theory and Practice of Digital Libraries 2017 (</w:t>
+      </w:r>
+      <w:r>
+        <w:rPr>
+          <w:i/>
+          <w:iCs/>
+        </w:rPr>
+        <w:t xml:space="preserve">TPDL</w:t>
+      </w:r>
+      <w:r>
+        <w:rPr>
+          <w:i/>
+          <w:iCs/>
+        </w:rPr>
+        <w:t xml:space="preserve"> </w:t>
+      </w:r>
+      <w:r>
+        <w:rPr>
+          <w:i/>
+          <w:iCs/>
+        </w:rPr>
+        <w:t xml:space="preserve">2017), Thessaloniki, Greece, September 21st, 2017</w:t>
+      </w:r>
+      <w:r>
+        <w:t xml:space="preserve">, edited by Philipp Mayr, Douglas Tudhope, Koraljka Golub, Christian Wartena, and Ernesto William De Luca, 1937:14–25.</w:t>
+      </w:r>
+      <w:r>
+        <w:t xml:space="preserve"> </w:t>
+      </w:r>
+      <w:r>
+        <w:t xml:space="preserve">CEUR</w:t>
+      </w:r>
+      <w:r>
+        <w:t xml:space="preserve"> </w:t>
+      </w:r>
+      <w:r>
+        <w:t xml:space="preserve">Workshop Proceedings. CEUR-WS.org.</w:t>
+      </w:r>
+    </w:p>
+    <w:bookmarkEnd w:id="89"/>
+    <w:bookmarkStart w:id="91" w:name="ref-piscopoWhatWeTalk2019"/>
+    <w:p>
+      <w:pPr>
+        <w:pStyle w:val="Bibliography"/>
+      </w:pPr>
+      <w:r>
+        <w:t xml:space="preserve">Piscopo, Alessandro, and Elena Simperl. 2019.</w:t>
+      </w:r>
+      <w:r>
+        <w:t xml:space="preserve"> </w:t>
+      </w:r>
+      <w:r>
+        <w:t xml:space="preserve">“What We Talk about When We Talk about Wikidata Quality: A Literature Survey.”</w:t>
+      </w:r>
+      <w:r>
+        <w:t xml:space="preserve"> </w:t>
+      </w:r>
+      <w:r>
+        <w:t xml:space="preserve">In</w:t>
+      </w:r>
+      <w:r>
+        <w:t xml:space="preserve"> </w:t>
+      </w:r>
+      <w:r>
+        <w:rPr>
+          <w:i/>
+          <w:iCs/>
+        </w:rPr>
+        <w:t xml:space="preserve">Proceedings of the 15th</w:t>
+      </w:r>
+      <w:r>
+        <w:rPr>
+          <w:i/>
+          <w:iCs/>
+        </w:rPr>
+        <w:t xml:space="preserve"> </w:t>
+      </w:r>
+      <w:r>
+        <w:rPr>
+          <w:i/>
+          <w:iCs/>
+        </w:rPr>
+        <w:t xml:space="preserve">International Symposium</w:t>
+      </w:r>
+      <w:r>
+        <w:rPr>
+          <w:i/>
+          <w:iCs/>
+        </w:rPr>
+        <w:t xml:space="preserve"> </w:t>
+      </w:r>
+      <w:r>
+        <w:rPr>
+          <w:i/>
+          <w:iCs/>
+        </w:rPr>
+        <w:t xml:space="preserve">on</w:t>
+      </w:r>
+      <w:r>
+        <w:rPr>
+          <w:i/>
+          <w:iCs/>
+        </w:rPr>
+        <w:t xml:space="preserve"> </w:t>
+      </w:r>
+      <w:r>
+        <w:rPr>
+          <w:i/>
+          <w:iCs/>
+        </w:rPr>
+        <w:t xml:space="preserve">Open Collaboration</w:t>
+      </w:r>
+      <w:r>
+        <w:t xml:space="preserve">, 1–11. Sk</w:t>
+      </w:r>
+      <w:r>
+        <w:t xml:space="preserve">ö</w:t>
+      </w:r>
+      <w:r>
+        <w:t xml:space="preserve">vde Sweden: ACM.</w:t>
+      </w:r>
+      <w:r>
+        <w:t xml:space="preserve"> </w:t>
+      </w:r>
+      <w:hyperlink r:id="rId90">
+        <w:r>
+          <w:rPr>
+            <w:rStyle w:val="Hyperlink"/>
+          </w:rPr>
+          <w:t xml:space="preserve">https://doi.org/10.1145/3306446.3340822</w:t>
+        </w:r>
+      </w:hyperlink>
+      <w:r>
+        <w:t xml:space="preserve">.</w:t>
+      </w:r>
+    </w:p>
+    <w:bookmarkEnd w:id="91"/>
+    <w:bookmarkStart w:id="93" w:name="ref-sahle_2016"/>
+    <w:p>
+      <w:pPr>
+        <w:pStyle w:val="Bibliography"/>
+      </w:pPr>
+      <w:r>
+        <w:t xml:space="preserve">Sahle, Patrick. 2016.</w:t>
+      </w:r>
+      <w:r>
+        <w:t xml:space="preserve"> </w:t>
+      </w:r>
+      <w:r>
+        <w:t xml:space="preserve">“2. What Is a Scholarly Digital Edition?”</w:t>
+      </w:r>
+      <w:r>
+        <w:t xml:space="preserve"> In</w:t>
+      </w:r>
+      <w:r>
+        <w:t xml:space="preserve"> </w:t>
+      </w:r>
+      <w:r>
+        <w:rPr>
+          <w:i/>
+          <w:iCs/>
+        </w:rPr>
+        <w:t xml:space="preserve">Digital Scholarly Editing : Theories and Practices</w:t>
+      </w:r>
+      <w:r>
+        <w:t xml:space="preserve">, edited by Matthew James Driscoll and Elena Pierazzo, 19–39. Digital Humanities Series. Cambridge: Open Book Publishers.</w:t>
+      </w:r>
+      <w:r>
+        <w:t xml:space="preserve"> </w:t>
+      </w:r>
+      <w:hyperlink r:id="rId92">
+        <w:r>
+          <w:rPr>
+            <w:rStyle w:val="Hyperlink"/>
+          </w:rPr>
+          <w:t xml:space="preserve">https://books.openedition.org/obp/3397</w:t>
+        </w:r>
+      </w:hyperlink>
+      <w:r>
+        <w:t xml:space="preserve">.</w:t>
+      </w:r>
+    </w:p>
+    <w:bookmarkEnd w:id="93"/>
+    <w:bookmarkStart w:id="95" w:name="ref-Santos24"/>
+    <w:p>
+      <w:pPr>
+        <w:pStyle w:val="Bibliography"/>
+      </w:pPr>
+      <w:r>
+        <w:t xml:space="preserve">Santos, Veronica, Daniel Schwabe, and Sérgio Lifschitz. 2024.</w:t>
+      </w:r>
+      <w:r>
+        <w:t xml:space="preserve"> </w:t>
+      </w:r>
+      <w:r>
+        <w:t xml:space="preserve">“Can You Trust Wikidata?”</w:t>
+      </w:r>
+      <w:r>
+        <w:t xml:space="preserve"> </w:t>
+      </w:r>
+      <w:r>
+        <w:rPr>
+          <w:i/>
+          <w:iCs/>
+        </w:rPr>
+        <w:t xml:space="preserve">Semantic Web</w:t>
+      </w:r>
+      <w:r>
+        <w:t xml:space="preserve"> </w:t>
+      </w:r>
+      <w:r>
+        <w:t xml:space="preserve">15 (6): 2271–92.</w:t>
+      </w:r>
+      <w:r>
+        <w:t xml:space="preserve"> </w:t>
+      </w:r>
+      <w:hyperlink r:id="rId94">
+        <w:r>
+          <w:rPr>
+            <w:rStyle w:val="Hyperlink"/>
+          </w:rPr>
+          <w:t xml:space="preserve">https://doi.org/10.3233/SW-243577</w:t>
+        </w:r>
+      </w:hyperlink>
+      <w:r>
+        <w:t xml:space="preserve">.</w:t>
+      </w:r>
+    </w:p>
+    <w:bookmarkEnd w:id="95"/>
+    <w:bookmarkStart w:id="97" w:name="X93500824e1a35d805803df92d9307dfab0955c0"/>
+    <w:p>
+      <w:pPr>
+        <w:pStyle w:val="Bibliography"/>
+      </w:pPr>
+      <w:r>
+        <w:t xml:space="preserve">Severo, Marta. 2021.</w:t>
+      </w:r>
+      <w:r>
+        <w:t xml:space="preserve"> </w:t>
+      </w:r>
+      <w:r>
+        <w:rPr>
+          <w:i/>
+          <w:iCs/>
+        </w:rPr>
+        <w:t xml:space="preserve">L’imp</w:t>
+      </w:r>
+      <w:r>
+        <w:rPr>
+          <w:i/>
+          <w:iCs/>
+        </w:rPr>
         <w:t xml:space="preserve">é</w:t>
       </w:r>
       <w:r>
-        <w:t xml:space="preserve">couverte.</w:t>
-      </w:r>
-    </w:p>
-    <w:bookmarkEnd w:id="88"/>
-    <w:bookmarkStart w:id="90" w:name="ref-mellet2020"/>
+        <w:rPr>
+          <w:i/>
+          <w:iCs/>
+        </w:rPr>
+        <w:t xml:space="preserve">ratif participatif: Institutions culturelles, amateurs et plateformes</w:t>
+      </w:r>
+      <w:r>
+        <w:t xml:space="preserve">. Bry-sur-Marne: Institut National de l’Audiovisuel (INA).</w:t>
+      </w:r>
+      <w:r>
+        <w:t xml:space="preserve"> </w:t>
+      </w:r>
+      <w:hyperlink r:id="rId96">
+        <w:r>
+          <w:rPr>
+            <w:rStyle w:val="Hyperlink"/>
+          </w:rPr>
+          <w:t xml:space="preserve">https://doi.org/10.3917/ina.sever.2021.01</w:t>
+        </w:r>
+      </w:hyperlink>
+      <w:r>
+        <w:t xml:space="preserve">.</w:t>
+      </w:r>
+    </w:p>
+    <w:bookmarkEnd w:id="97"/>
+    <w:bookmarkStart w:id="99" w:name="ref-shenoyStudyQualityWikidata2022"/>
     <w:p>
       <w:pPr>
         <w:pStyle w:val="Bibliography"/>
       </w:pPr>
       <w:r>
-        <w:t xml:space="preserve">Mellet, Margot. 2020.</w:t>
-      </w:r>
-      <w:r>
-        <w:t xml:space="preserve"> </w:t>
-      </w:r>
-      <w:r>
-        <w:t xml:space="preserve">“Penser le palimpseste numérique. Le projet d’édition numérique collaborative de l’Anthologie palatine.”</w:t>
-      </w:r>
-      <w:r>
-        <w:t xml:space="preserve"> </w:t>
-      </w:r>
-      <w:r>
-        <w:rPr>
-          <w:i/>
-          <w:iCs/>
-        </w:rPr>
-        <w:t xml:space="preserve">Captures</w:t>
-      </w:r>
-      <w:r>
-        <w:t xml:space="preserve"> </w:t>
-      </w:r>
-      <w:r>
-        <w:t xml:space="preserve">5 (1). https://doi.org/</w:t>
-      </w:r>
-      <w:hyperlink r:id="rId89">
-        <w:r>
-          <w:rPr>
-            <w:rStyle w:val="Hyperlink"/>
-          </w:rPr>
-          <w:t xml:space="preserve">https://doi.org/10.7202/1073479ar</w:t>
+        <w:t xml:space="preserve">Shenoy, Kartik, Filip Ilievski, Daniel Garijo, Daniel Schwabe, and Pedro Szekely. 2022.</w:t>
+      </w:r>
+      <w:r>
+        <w:t xml:space="preserve"> </w:t>
+      </w:r>
+      <w:r>
+        <w:t xml:space="preserve">“A</w:t>
+      </w:r>
+      <w:r>
+        <w:t xml:space="preserve"> </w:t>
+      </w:r>
+      <w:r>
+        <w:t xml:space="preserve">Study</w:t>
+      </w:r>
+      <w:r>
+        <w:t xml:space="preserve"> </w:t>
+      </w:r>
+      <w:r>
+        <w:t xml:space="preserve">of the</w:t>
+      </w:r>
+      <w:r>
+        <w:t xml:space="preserve"> </w:t>
+      </w:r>
+      <w:r>
+        <w:t xml:space="preserve">Quality</w:t>
+      </w:r>
+      <w:r>
+        <w:t xml:space="preserve"> </w:t>
+      </w:r>
+      <w:r>
+        <w:t xml:space="preserve">of</w:t>
+      </w:r>
+      <w:r>
+        <w:t xml:space="preserve"> </w:t>
+      </w:r>
+      <w:r>
+        <w:t xml:space="preserve">Wikidata</w:t>
+      </w:r>
+      <w:r>
+        <w:t xml:space="preserve">.”</w:t>
+      </w:r>
+      <w:r>
+        <w:t xml:space="preserve"> </w:t>
+      </w:r>
+      <w:r>
+        <w:rPr>
+          <w:i/>
+          <w:iCs/>
+        </w:rPr>
+        <w:t xml:space="preserve">Journal of Web Semantics</w:t>
+      </w:r>
+      <w:r>
+        <w:t xml:space="preserve"> </w:t>
+      </w:r>
+      <w:r>
+        <w:t xml:space="preserve">72:100679.</w:t>
+      </w:r>
+      <w:r>
+        <w:t xml:space="preserve"> </w:t>
+      </w:r>
+      <w:hyperlink r:id="rId98">
+        <w:r>
+          <w:rPr>
+            <w:rStyle w:val="Hyperlink"/>
+          </w:rPr>
+          <w:t xml:space="preserve">https://doi.org/10.1016/j.websem.2021.100679</w:t>
         </w:r>
       </w:hyperlink>
       <w:r>
         <w:t xml:space="preserve">.</w:t>
       </w:r>
     </w:p>
-    <w:bookmarkEnd w:id="90"/>
-    <w:bookmarkStart w:id="91" w:name="ref-neubertWikidataLinkingHub2017"/>
+    <w:bookmarkEnd w:id="99"/>
+    <w:bookmarkStart w:id="100" w:name="ref-surowieckiWisdomCrowdsWhy2004"/>
     <w:p>
       <w:pPr>
         <w:pStyle w:val="Bibliography"/>
       </w:pPr>
       <w:r>
-        <w:t xml:space="preserve">Neubert, Joachim. 2017.</w:t>
-      </w:r>
-      <w:r>
-        <w:t xml:space="preserve"> </w:t>
-      </w:r>
-      <w:r>
-        <w:t xml:space="preserve">“Wikidata as a</w:t>
-      </w:r>
-      <w:r>
-        <w:t xml:space="preserve"> </w:t>
-      </w:r>
-      <w:r>
-        <w:t xml:space="preserve">Linking Hub</w:t>
+        <w:t xml:space="preserve">Surowiecki, James. 2004.</w:t>
+      </w:r>
+      <w:r>
+        <w:t xml:space="preserve"> </w:t>
+      </w:r>
+      <w:r>
+        <w:rPr>
+          <w:i/>
+          <w:iCs/>
+        </w:rPr>
+        <w:t xml:space="preserve">The</w:t>
+      </w:r>
+      <w:r>
+        <w:rPr>
+          <w:i/>
+          <w:iCs/>
+        </w:rPr>
+        <w:t xml:space="preserve"> </w:t>
+      </w:r>
+      <w:r>
+        <w:rPr>
+          <w:i/>
+          <w:iCs/>
+        </w:rPr>
+        <w:t xml:space="preserve">Wisdom</w:t>
+      </w:r>
+      <w:r>
+        <w:rPr>
+          <w:i/>
+          <w:iCs/>
+        </w:rPr>
+        <w:t xml:space="preserve"> </w:t>
+      </w:r>
+      <w:r>
+        <w:rPr>
+          <w:i/>
+          <w:iCs/>
+        </w:rPr>
+        <w:t xml:space="preserve">of</w:t>
+      </w:r>
+      <w:r>
+        <w:rPr>
+          <w:i/>
+          <w:iCs/>
+        </w:rPr>
+        <w:t xml:space="preserve"> </w:t>
+      </w:r>
+      <w:r>
+        <w:rPr>
+          <w:i/>
+          <w:iCs/>
+        </w:rPr>
+        <w:t xml:space="preserve">Crowds</w:t>
+      </w:r>
+      <w:r>
+        <w:rPr>
+          <w:i/>
+          <w:iCs/>
+        </w:rPr>
+        <w:t xml:space="preserve">:</w:t>
+      </w:r>
+      <w:r>
+        <w:rPr>
+          <w:i/>
+          <w:iCs/>
+        </w:rPr>
+        <w:t xml:space="preserve"> </w:t>
+      </w:r>
+      <w:r>
+        <w:rPr>
+          <w:i/>
+          <w:iCs/>
+        </w:rPr>
+        <w:t xml:space="preserve">Why</w:t>
+      </w:r>
+      <w:r>
+        <w:rPr>
+          <w:i/>
+          <w:iCs/>
+        </w:rPr>
+        <w:t xml:space="preserve"> </w:t>
+      </w:r>
+      <w:r>
+        <w:rPr>
+          <w:i/>
+          <w:iCs/>
+        </w:rPr>
+        <w:t xml:space="preserve">the</w:t>
+      </w:r>
+      <w:r>
+        <w:rPr>
+          <w:i/>
+          <w:iCs/>
+        </w:rPr>
+        <w:t xml:space="preserve"> </w:t>
+      </w:r>
+      <w:r>
+        <w:rPr>
+          <w:i/>
+          <w:iCs/>
+        </w:rPr>
+        <w:t xml:space="preserve">Many</w:t>
+      </w:r>
+      <w:r>
+        <w:rPr>
+          <w:i/>
+          <w:iCs/>
+        </w:rPr>
+        <w:t xml:space="preserve"> </w:t>
+      </w:r>
+      <w:r>
+        <w:rPr>
+          <w:i/>
+          <w:iCs/>
+        </w:rPr>
+        <w:t xml:space="preserve">Are</w:t>
+      </w:r>
+      <w:r>
+        <w:rPr>
+          <w:i/>
+          <w:iCs/>
+        </w:rPr>
+        <w:t xml:space="preserve"> </w:t>
+      </w:r>
+      <w:r>
+        <w:rPr>
+          <w:i/>
+          <w:iCs/>
+        </w:rPr>
+        <w:t xml:space="preserve">Smarter</w:t>
+      </w:r>
+      <w:r>
+        <w:rPr>
+          <w:i/>
+          <w:iCs/>
+        </w:rPr>
+        <w:t xml:space="preserve"> </w:t>
+      </w:r>
+      <w:r>
+        <w:rPr>
+          <w:i/>
+          <w:iCs/>
+        </w:rPr>
+        <w:t xml:space="preserve">Than the</w:t>
+      </w:r>
+      <w:r>
+        <w:rPr>
+          <w:i/>
+          <w:iCs/>
+        </w:rPr>
+        <w:t xml:space="preserve"> </w:t>
+      </w:r>
+      <w:r>
+        <w:rPr>
+          <w:i/>
+          <w:iCs/>
+        </w:rPr>
+        <w:t xml:space="preserve">Few</w:t>
+      </w:r>
+      <w:r>
+        <w:rPr>
+          <w:i/>
+          <w:iCs/>
+        </w:rPr>
+        <w:t xml:space="preserve"> </w:t>
+      </w:r>
+      <w:r>
+        <w:rPr>
+          <w:i/>
+          <w:iCs/>
+        </w:rPr>
+        <w:t xml:space="preserve">and How</w:t>
+      </w:r>
+      <w:r>
+        <w:rPr>
+          <w:i/>
+          <w:iCs/>
+        </w:rPr>
+        <w:t xml:space="preserve"> </w:t>
+      </w:r>
+      <w:r>
+        <w:rPr>
+          <w:i/>
+          <w:iCs/>
+        </w:rPr>
+        <w:t xml:space="preserve">Collective Wisdom Shapes Business</w:t>
+      </w:r>
+      <w:r>
+        <w:rPr>
+          <w:i/>
+          <w:iCs/>
+        </w:rPr>
+        <w:t xml:space="preserve">,</w:t>
+      </w:r>
+      <w:r>
+        <w:rPr>
+          <w:i/>
+          <w:iCs/>
+        </w:rPr>
+        <w:t xml:space="preserve"> </w:t>
+      </w:r>
+      <w:r>
+        <w:rPr>
+          <w:i/>
+          <w:iCs/>
+        </w:rPr>
+        <w:t xml:space="preserve">Economies</w:t>
+      </w:r>
+      <w:r>
+        <w:rPr>
+          <w:i/>
+          <w:iCs/>
+        </w:rPr>
+        <w:t xml:space="preserve">,</w:t>
+      </w:r>
+      <w:r>
+        <w:rPr>
+          <w:i/>
+          <w:iCs/>
+        </w:rPr>
+        <w:t xml:space="preserve"> </w:t>
+      </w:r>
+      <w:r>
+        <w:rPr>
+          <w:i/>
+          <w:iCs/>
+        </w:rPr>
+        <w:t xml:space="preserve">Societies</w:t>
+      </w:r>
+      <w:r>
+        <w:rPr>
+          <w:i/>
+          <w:iCs/>
+        </w:rPr>
+        <w:t xml:space="preserve">, and</w:t>
+      </w:r>
+      <w:r>
+        <w:rPr>
+          <w:i/>
+          <w:iCs/>
+        </w:rPr>
+        <w:t xml:space="preserve"> </w:t>
+      </w:r>
+      <w:r>
+        <w:rPr>
+          <w:i/>
+          <w:iCs/>
+        </w:rPr>
+        <w:t xml:space="preserve">Nations</w:t>
+      </w:r>
+      <w:r>
+        <w:t xml:space="preserve">. New York: Doubleday.</w:t>
+      </w:r>
+    </w:p>
+    <w:bookmarkEnd w:id="100"/>
+    <w:bookmarkStart w:id="102" w:name="Xc0c9be6670753b9e233d2ccaceb8f56b91b05f5"/>
+    <w:p>
+      <w:pPr>
+        <w:pStyle w:val="Bibliography"/>
+      </w:pPr>
+      <w:r>
+        <w:t xml:space="preserve">Thornton, Katherine, Kenneth Seals Nutt, and Anne Chen. 2024.</w:t>
+      </w:r>
+      <w:r>
+        <w:t xml:space="preserve"> </w:t>
+      </w:r>
+      <w:r>
+        <w:t xml:space="preserve">“Encoding</w:t>
+      </w:r>
+      <w:r>
+        <w:t xml:space="preserve"> </w:t>
+      </w:r>
+      <w:r>
+        <w:t xml:space="preserve">Archaeological Data Models</w:t>
+      </w:r>
+      <w:r>
+        <w:t xml:space="preserve"> </w:t>
+      </w:r>
+      <w:r>
+        <w:t xml:space="preserve">as</w:t>
+      </w:r>
+      <w:r>
+        <w:t xml:space="preserve"> </w:t>
+      </w:r>
+      <w:r>
+        <w:t xml:space="preserve">Wikidata Schemas</w:t>
+      </w:r>
+      <w:r>
+        <w:t xml:space="preserve">:</w:t>
+      </w:r>
+      <w:r>
+        <w:t xml:space="preserve"> </w:t>
+      </w:r>
+      <w:r>
+        <w:t xml:space="preserve">Utilizing Shape Expressions</w:t>
+      </w:r>
+      <w:r>
+        <w:t xml:space="preserve"> </w:t>
+      </w:r>
+      <w:r>
+        <w:t xml:space="preserve">to</w:t>
+      </w:r>
+      <w:r>
+        <w:t xml:space="preserve"> </w:t>
+      </w:r>
+      <w:r>
+        <w:t xml:space="preserve">Structure Collaborative Linked Open Data</w:t>
       </w:r>
       <w:r>
         <w:t xml:space="preserve"> </w:t>
@@ -3139,34 +3908,548 @@
         <w:t xml:space="preserve"> </w:t>
       </w:r>
       <w:r>
-        <w:t xml:space="preserve">Knowledge Organization Systems</w:t>
-      </w:r>
-      <w:r>
-        <w:t xml:space="preserve">?</w:t>
-      </w:r>
-      <w:r>
-        <w:t xml:space="preserve"> </w:t>
-      </w:r>
-      <w:r>
-        <w:t xml:space="preserve">Integrating</w:t>
-      </w:r>
-      <w:r>
-        <w:t xml:space="preserve"> </w:t>
-      </w:r>
-      <w:r>
-        <w:t xml:space="preserve">an</w:t>
-      </w:r>
-      <w:r>
-        <w:t xml:space="preserve"> </w:t>
-      </w:r>
-      <w:r>
-        <w:t xml:space="preserve">Authority Mapping</w:t>
-      </w:r>
-      <w:r>
-        <w:t xml:space="preserve"> </w:t>
-      </w:r>
-      <w:r>
-        <w:t xml:space="preserve">into</w:t>
+        <w:t xml:space="preserve">Digital Storytelling Within</w:t>
+      </w:r>
+      <w:r>
+        <w:t xml:space="preserve"> </w:t>
+      </w:r>
+      <w:r>
+        <w:t xml:space="preserve">the</w:t>
+      </w:r>
+      <w:r>
+        <w:t xml:space="preserve"> </w:t>
+      </w:r>
+      <w:r>
+        <w:t xml:space="preserve">International Dura-Europos Archive</w:t>
+      </w:r>
+      <w:r>
+        <w:t xml:space="preserve">.”</w:t>
+      </w:r>
+      <w:r>
+        <w:t xml:space="preserve"> </w:t>
+      </w:r>
+      <w:r>
+        <w:rPr>
+          <w:i/>
+          <w:iCs/>
+        </w:rPr>
+        <w:t xml:space="preserve">The International Journal of Technology, Knowledge, and Society</w:t>
+      </w:r>
+      <w:r>
+        <w:t xml:space="preserve"> </w:t>
+      </w:r>
+      <w:r>
+        <w:t xml:space="preserve">21 (1): 69–83.</w:t>
+      </w:r>
+      <w:r>
+        <w:t xml:space="preserve"> </w:t>
+      </w:r>
+      <w:hyperlink r:id="rId101">
+        <w:r>
+          <w:rPr>
+            <w:rStyle w:val="Hyperlink"/>
+          </w:rPr>
+          <w:t xml:space="preserve">https://doi.org/10.18848/1832-3669/CGP/v21i01/69-83</w:t>
+        </w:r>
+      </w:hyperlink>
+      <w:r>
+        <w:t xml:space="preserve">.</w:t>
+      </w:r>
+    </w:p>
+    <w:bookmarkEnd w:id="102"/>
+    <w:bookmarkStart w:id="104" w:name="ref-thorntonUsingShapeExpressions2019"/>
+    <w:p>
+      <w:pPr>
+        <w:pStyle w:val="Bibliography"/>
+      </w:pPr>
+      <w:r>
+        <w:t xml:space="preserve">Thornton, Katherine, Harold Solbrig, Gregory S. Stupp, Jose Emilio Labra Gayo, Daniel Mietchen, Eric Prud’hommeaux, and Andra Waagmeester. 2019.</w:t>
+      </w:r>
+      <w:r>
+        <w:t xml:space="preserve"> </w:t>
+      </w:r>
+      <w:r>
+        <w:t xml:space="preserve">“Using</w:t>
+      </w:r>
+      <w:r>
+        <w:t xml:space="preserve"> </w:t>
+      </w:r>
+      <w:r>
+        <w:t xml:space="preserve">Shape Expressions</w:t>
+      </w:r>
+      <w:r>
+        <w:t xml:space="preserve"> </w:t>
+      </w:r>
+      <w:r>
+        <w:t xml:space="preserve">(</w:t>
+      </w:r>
+      <w:r>
+        <w:t xml:space="preserve">ShEx</w:t>
+      </w:r>
+      <w:r>
+        <w:t xml:space="preserve">) to</w:t>
+      </w:r>
+      <w:r>
+        <w:t xml:space="preserve"> </w:t>
+      </w:r>
+      <w:r>
+        <w:t xml:space="preserve">Share RDF Data Models</w:t>
+      </w:r>
+      <w:r>
+        <w:t xml:space="preserve"> </w:t>
+      </w:r>
+      <w:r>
+        <w:t xml:space="preserve">and to</w:t>
+      </w:r>
+      <w:r>
+        <w:t xml:space="preserve"> </w:t>
+      </w:r>
+      <w:r>
+        <w:t xml:space="preserve">Guide Curation</w:t>
+      </w:r>
+      <w:r>
+        <w:t xml:space="preserve"> </w:t>
+      </w:r>
+      <w:r>
+        <w:t xml:space="preserve">with</w:t>
+      </w:r>
+      <w:r>
+        <w:t xml:space="preserve"> </w:t>
+      </w:r>
+      <w:r>
+        <w:t xml:space="preserve">Rigorous Validation</w:t>
+      </w:r>
+      <w:r>
+        <w:t xml:space="preserve">.”</w:t>
+      </w:r>
+      <w:r>
+        <w:t xml:space="preserve"> </w:t>
+      </w:r>
+      <w:r>
+        <w:t xml:space="preserve">In</w:t>
+      </w:r>
+      <w:r>
+        <w:t xml:space="preserve"> </w:t>
+      </w:r>
+      <w:r>
+        <w:rPr>
+          <w:i/>
+          <w:iCs/>
+        </w:rPr>
+        <w:t xml:space="preserve">The</w:t>
+      </w:r>
+      <w:r>
+        <w:rPr>
+          <w:i/>
+          <w:iCs/>
+        </w:rPr>
+        <w:t xml:space="preserve"> </w:t>
+      </w:r>
+      <w:r>
+        <w:rPr>
+          <w:i/>
+          <w:iCs/>
+        </w:rPr>
+        <w:t xml:space="preserve">Semantic Web</w:t>
+      </w:r>
+      <w:r>
+        <w:t xml:space="preserve">, edited by Pascal Hitzler, Miriam Fernández, Krzysztof Janowicz, Amrapali Zaveri, Alasdair J. G. Gray, Vanessa Lopez, Armin Haller, and Karl Hammar, 11503:606–20. Cham: Springer International Publishing.</w:t>
+      </w:r>
+      <w:r>
+        <w:t xml:space="preserve"> </w:t>
+      </w:r>
+      <w:hyperlink r:id="rId103">
+        <w:r>
+          <w:rPr>
+            <w:rStyle w:val="Hyperlink"/>
+          </w:rPr>
+          <w:t xml:space="preserve">https://doi.org/10.1007/978-3-030-21348-0_39</w:t>
+        </w:r>
+      </w:hyperlink>
+      <w:r>
+        <w:t xml:space="preserve">.</w:t>
+      </w:r>
+    </w:p>
+    <w:bookmarkEnd w:id="104"/>
+    <w:bookmarkStart w:id="106" w:name="X76eaf9d9167b07f266dd857e10f7a7e0c6b1aac"/>
+    <w:p>
+      <w:pPr>
+        <w:pStyle w:val="Bibliography"/>
+      </w:pPr>
+      <w:r>
+        <w:t xml:space="preserve">Van Veen, Theo. 2019.</w:t>
+      </w:r>
+      <w:r>
+        <w:t xml:space="preserve"> </w:t>
+      </w:r>
+      <w:r>
+        <w:t xml:space="preserve">“Wikidata:</w:t>
+      </w:r>
+      <w:r>
+        <w:t xml:space="preserve"> </w:t>
+      </w:r>
+      <w:r>
+        <w:t xml:space="preserve">From</w:t>
+      </w:r>
+      <w:r>
+        <w:t xml:space="preserve"> </w:t>
+      </w:r>
+      <w:r>
+        <w:t xml:space="preserve">‘an’</w:t>
+      </w:r>
+      <w:r>
+        <w:t xml:space="preserve"> </w:t>
+      </w:r>
+      <w:r>
+        <w:t xml:space="preserve">Identifier</w:t>
+      </w:r>
+      <w:r>
+        <w:t xml:space="preserve"> </w:t>
+      </w:r>
+      <w:r>
+        <w:t xml:space="preserve">to</w:t>
+      </w:r>
+      <w:r>
+        <w:t xml:space="preserve"> </w:t>
+      </w:r>
+      <w:r>
+        <w:t xml:space="preserve">‘the’</w:t>
+      </w:r>
+      <w:r>
+        <w:t xml:space="preserve"> </w:t>
+      </w:r>
+      <w:r>
+        <w:t xml:space="preserve">Identifier</w:t>
+      </w:r>
+      <w:r>
+        <w:t xml:space="preserve">.”</w:t>
+      </w:r>
+      <w:r>
+        <w:t xml:space="preserve"> </w:t>
+      </w:r>
+      <w:r>
+        <w:rPr>
+          <w:i/>
+          <w:iCs/>
+        </w:rPr>
+        <w:t xml:space="preserve">Information Technology and Libraries</w:t>
+      </w:r>
+      <w:r>
+        <w:t xml:space="preserve"> </w:t>
+      </w:r>
+      <w:r>
+        <w:t xml:space="preserve">38 (2): 72–81.</w:t>
+      </w:r>
+      <w:r>
+        <w:t xml:space="preserve"> </w:t>
+      </w:r>
+      <w:hyperlink r:id="rId105">
+        <w:r>
+          <w:rPr>
+            <w:rStyle w:val="Hyperlink"/>
+          </w:rPr>
+          <w:t xml:space="preserve">https://doi.org/10.6017/ital.v38i2.10886</w:t>
+        </w:r>
+      </w:hyperlink>
+      <w:r>
+        <w:t xml:space="preserve">.</w:t>
+      </w:r>
+    </w:p>
+    <w:bookmarkEnd w:id="106"/>
+    <w:bookmarkStart w:id="108" w:name="ref-verstraete2024"/>
+    <w:p>
+      <w:pPr>
+        <w:pStyle w:val="Bibliography"/>
+      </w:pPr>
+      <w:r>
+        <w:t xml:space="preserve">Verstraete, Mathilde. 2024.</w:t>
+      </w:r>
+      <w:r>
+        <w:t xml:space="preserve"> </w:t>
+      </w:r>
+      <w:r>
+        <w:t xml:space="preserve">“Dynamiques auctoriales au sein du projet d’édition numérique collaborative de l’ Anthologie grecque.”</w:t>
+      </w:r>
+      <w:r>
+        <w:t xml:space="preserve"> </w:t>
+      </w:r>
+      <w:r>
+        <w:rPr>
+          <w:i/>
+          <w:iCs/>
+        </w:rPr>
+        <w:t xml:space="preserve">Sens Public</w:t>
+      </w:r>
+      <w:r>
+        <w:t xml:space="preserve">.</w:t>
+      </w:r>
+      <w:r>
+        <w:t xml:space="preserve"> </w:t>
+      </w:r>
+      <w:hyperlink r:id="rId107">
+        <w:r>
+          <w:rPr>
+            <w:rStyle w:val="Hyperlink"/>
+          </w:rPr>
+          <w:t xml:space="preserve">http://sens-public.org/articles/1692/</w:t>
+        </w:r>
+      </w:hyperlink>
+      <w:r>
+        <w:t xml:space="preserve">.</w:t>
+      </w:r>
+    </w:p>
+    <w:bookmarkEnd w:id="108"/>
+    <w:bookmarkStart w:id="109" w:name="X0f0dc6b5bb60387299ab4a121a7a3862e4c0b2a"/>
+    <w:p>
+      <w:pPr>
+        <w:pStyle w:val="Bibliography"/>
+      </w:pPr>
+      <w:r>
+        <w:t xml:space="preserve">Verstraete, Mathilde, and Margot Mellet. 2024.</w:t>
+      </w:r>
+      <w:r>
+        <w:t xml:space="preserve"> </w:t>
+      </w:r>
+      <w:r>
+        <w:t xml:space="preserve">“Passés et présents anthologiques. Le projet d’édition numérique collaborative de l’Anthologie grecque.”</w:t>
+      </w:r>
+      <w:r>
+        <w:t xml:space="preserve"> </w:t>
+      </w:r>
+      <w:r>
+        <w:t xml:space="preserve">In</w:t>
+      </w:r>
+      <w:r>
+        <w:t xml:space="preserve"> </w:t>
+      </w:r>
+      <w:r>
+        <w:rPr>
+          <w:i/>
+          <w:iCs/>
+        </w:rPr>
+        <w:t xml:space="preserve">Communautés et pratiques d’écritures des patrimoines et des mémoires</w:t>
+      </w:r>
+      <w:r>
+        <w:t xml:space="preserve">, edited by Nicolas Sauret and Marta Severo, 67–80. Paris: Presses universitaires de Paris-Nanterre.</w:t>
+      </w:r>
+    </w:p>
+    <w:bookmarkEnd w:id="109"/>
+    <w:bookmarkStart w:id="111" w:name="X49b7f14284e5c85b05ed9ef488a8af1746e486f"/>
+    <w:p>
+      <w:pPr>
+        <w:pStyle w:val="Bibliography"/>
+      </w:pPr>
+      <w:r>
+        <w:t xml:space="preserve">Vitali-Rosati, Marcello, Margot Mellet, Servanne Monjour, Antoine Fauchié, Timothée Guicherd, David Larlet, and Enrico Agostini-Marchese. 2021.</w:t>
+      </w:r>
+      <w:r>
+        <w:t xml:space="preserve"> </w:t>
+      </w:r>
+      <w:r>
+        <w:t xml:space="preserve">“</w:t>
+      </w:r>
+      <w:r>
+        <w:t xml:space="preserve">L’</w:t>
+      </w:r>
+      <w:r>
+        <w:t xml:space="preserve">é</w:t>
+      </w:r>
+      <w:r>
+        <w:t xml:space="preserve">pop</w:t>
+      </w:r>
+      <w:r>
+        <w:t xml:space="preserve">é</w:t>
+      </w:r>
+      <w:r>
+        <w:t xml:space="preserve">e num</w:t>
+      </w:r>
+      <w:r>
+        <w:t xml:space="preserve">é</w:t>
+      </w:r>
+      <w:r>
+        <w:t xml:space="preserve">rique de l’Anthologie grecque : entre questions</w:t>
+      </w:r>
+      <w:r>
+        <w:t xml:space="preserve"> </w:t>
+      </w:r>
+      <w:r>
+        <w:t xml:space="preserve">é</w:t>
+      </w:r>
+      <w:r>
+        <w:t xml:space="preserve">pist</w:t>
+      </w:r>
+      <w:r>
+        <w:t xml:space="preserve">é</w:t>
+      </w:r>
+      <w:r>
+        <w:t xml:space="preserve">mologiques, mod</w:t>
+      </w:r>
+      <w:r>
+        <w:t xml:space="preserve">è</w:t>
+      </w:r>
+      <w:r>
+        <w:t xml:space="preserve">les techniques et dynamiques collaboratives</w:t>
+      </w:r>
+      <w:r>
+        <w:t xml:space="preserve">.”</w:t>
+      </w:r>
+      <w:r>
+        <w:t xml:space="preserve"> </w:t>
+      </w:r>
+      <w:r>
+        <w:rPr>
+          <w:i/>
+          <w:iCs/>
+        </w:rPr>
+        <w:t xml:space="preserve">Sens public</w:t>
+      </w:r>
+      <w:r>
+        <w:t xml:space="preserve">.</w:t>
+      </w:r>
+      <w:r>
+        <w:t xml:space="preserve"> </w:t>
+      </w:r>
+      <w:hyperlink r:id="rId110">
+        <w:r>
+          <w:rPr>
+            <w:rStyle w:val="Hyperlink"/>
+          </w:rPr>
+          <w:t xml:space="preserve">https://doi.org/10.7202/1089649ar</w:t>
+        </w:r>
+      </w:hyperlink>
+      <w:r>
+        <w:t xml:space="preserve">.</w:t>
+      </w:r>
+    </w:p>
+    <w:bookmarkEnd w:id="111"/>
+    <w:bookmarkStart w:id="112" w:name="ref-waltz_anthologie_1931"/>
+    <w:p>
+      <w:pPr>
+        <w:pStyle w:val="Bibliography"/>
+      </w:pPr>
+      <w:r>
+        <w:t xml:space="preserve">Waltz, Pierre. 1931.</w:t>
+      </w:r>
+      <w:r>
+        <w:t xml:space="preserve"> </w:t>
+      </w:r>
+      <w:r>
+        <w:rPr>
+          <w:i/>
+          <w:iCs/>
+        </w:rPr>
+        <w:t xml:space="preserve">Anthologie Grecque. Tome III : Anthologie Palatine, Livre VI</w:t>
+      </w:r>
+      <w:r>
+        <w:t xml:space="preserve">. Budé. Paris: Les Belles Lettres.</w:t>
+      </w:r>
+    </w:p>
+    <w:bookmarkEnd w:id="112"/>
+    <w:bookmarkStart w:id="113" w:name="ref-waltz_anthologie_1960"/>
+    <w:p>
+      <w:pPr>
+        <w:pStyle w:val="Bibliography"/>
+      </w:pPr>
+      <w:r>
+        <w:t xml:space="preserve">———. 1960.</w:t>
+      </w:r>
+      <w:r>
+        <w:t xml:space="preserve"> </w:t>
+      </w:r>
+      <w:r>
+        <w:rPr>
+          <w:i/>
+          <w:iCs/>
+        </w:rPr>
+        <w:t xml:space="preserve">Anthologie Grecque. Tome V : Anthologie Palatine, Livre VII, Épigrammes 364-748</w:t>
+      </w:r>
+      <w:r>
+        <w:t xml:space="preserve">. Translated by Edouard Des Places, M. Dumitrescu, H. Le Maitre, and G. Soury. XIII vols. Budé. Paris: Les Belles Lettres.</w:t>
+      </w:r>
+    </w:p>
+    <w:bookmarkEnd w:id="113"/>
+    <w:bookmarkStart w:id="114" w:name="ref-waltz_anthologie_1974"/>
+    <w:p>
+      <w:pPr>
+        <w:pStyle w:val="Bibliography"/>
+      </w:pPr>
+      <w:r>
+        <w:t xml:space="preserve">———. 1974.</w:t>
+      </w:r>
+      <w:r>
+        <w:t xml:space="preserve"> </w:t>
+      </w:r>
+      <w:r>
+        <w:rPr>
+          <w:i/>
+          <w:iCs/>
+        </w:rPr>
+        <w:t xml:space="preserve">Anthologie Grecque. Tome VIII: Anthologie Palatine, Livre IX, Épigrammes 359-827</w:t>
+      </w:r>
+      <w:r>
+        <w:t xml:space="preserve">. Edited by Jean Irigoin, Pierre Laurens, and G. Soury. XIII vols. Budé. Paris: Les Belles Lettres.</w:t>
+      </w:r>
+    </w:p>
+    <w:bookmarkEnd w:id="114"/>
+    <w:bookmarkStart w:id="115" w:name="ref-waltz_anthologie_2003"/>
+    <w:p>
+      <w:pPr>
+        <w:pStyle w:val="Bibliography"/>
+      </w:pPr>
+      <w:r>
+        <w:t xml:space="preserve">———. 2003.</w:t>
+      </w:r>
+      <w:r>
+        <w:t xml:space="preserve"> </w:t>
+      </w:r>
+      <w:r>
+        <w:rPr>
+          <w:i/>
+          <w:iCs/>
+        </w:rPr>
+        <w:t xml:space="preserve">Anthologie Grecque. Tome II : Anthologie Palatine, Livre v</w:t>
+      </w:r>
+      <w:r>
+        <w:t xml:space="preserve">. Edited by Jean Irigoin. XIII vols. Budé. Paris: Les Belles Lettres.</w:t>
+      </w:r>
+    </w:p>
+    <w:bookmarkEnd w:id="115"/>
+    <w:bookmarkStart w:id="116" w:name="ref-waltz_anthologie_1929"/>
+    <w:p>
+      <w:pPr>
+        <w:pStyle w:val="Bibliography"/>
+      </w:pPr>
+      <w:r>
+        <w:t xml:space="preserve">Waltz, Pierre, Jean Guillon, Jean Irigoin, P. Camelot, Alphonse Dain, Edouard Des Places, A.-M. Desrousseaux, et al. 1929–1994.</w:t>
+      </w:r>
+      <w:r>
+        <w:t xml:space="preserve"> </w:t>
+      </w:r>
+      <w:r>
+        <w:rPr>
+          <w:i/>
+          <w:iCs/>
+        </w:rPr>
+        <w:t xml:space="preserve">Anthologie Grecque</w:t>
+      </w:r>
+      <w:r>
+        <w:t xml:space="preserve">. Vol. I–XIII. XIII vols. Budé. Paris: Les Belles Lettres.</w:t>
+      </w:r>
+    </w:p>
+    <w:bookmarkEnd w:id="116"/>
+    <w:bookmarkStart w:id="118" w:name="ref-zhaoSystematicReviewWikidata2023"/>
+    <w:p>
+      <w:pPr>
+        <w:pStyle w:val="Bibliography"/>
+      </w:pPr>
+      <w:r>
+        <w:t xml:space="preserve">Zhao, Fudie. 2023.</w:t>
+      </w:r>
+      <w:r>
+        <w:t xml:space="preserve"> </w:t>
+      </w:r>
+      <w:r>
+        <w:t xml:space="preserve">“A Systematic Review of</w:t>
       </w:r>
       <w:r>
         <w:t xml:space="preserve"> </w:t>
@@ -3178,1522 +4461,54 @@
         <w:t xml:space="preserve"> </w:t>
       </w:r>
       <w:r>
-        <w:t xml:space="preserve">and</w:t>
-      </w:r>
-      <w:r>
-        <w:t xml:space="preserve"> </w:t>
-      </w:r>
-      <w:r>
-        <w:t xml:space="preserve">Learning Lessons</w:t>
-      </w:r>
-      <w:r>
-        <w:t xml:space="preserve"> </w:t>
-      </w:r>
-      <w:r>
-        <w:t xml:space="preserve">for</w:t>
-      </w:r>
-      <w:r>
-        <w:t xml:space="preserve"> </w:t>
-      </w:r>
-      <w:r>
-        <w:t xml:space="preserve">KOS Mappings</w:t>
-      </w:r>
-      <w:r>
-        <w:t xml:space="preserve">.”</w:t>
-      </w:r>
-      <w:r>
-        <w:t xml:space="preserve"> </w:t>
-      </w:r>
-      <w:r>
-        <w:t xml:space="preserve">In</w:t>
-      </w:r>
-      <w:r>
-        <w:t xml:space="preserve"> </w:t>
-      </w:r>
-      <w:r>
-        <w:rPr>
-          <w:i/>
-          <w:iCs/>
-        </w:rPr>
-        <w:t xml:space="preserve">Proceedings of the 17th European Networked Knowledge Organization Systems Workshop Co-Located with the 21st International Conference on Theory and Practice of Digital Libraries 2017 (</w:t>
-      </w:r>
-      <w:r>
-        <w:rPr>
-          <w:i/>
-          <w:iCs/>
-        </w:rPr>
-        <w:t xml:space="preserve">TPDL</w:t>
-      </w:r>
-      <w:r>
-        <w:rPr>
-          <w:i/>
-          <w:iCs/>
-        </w:rPr>
-        <w:t xml:space="preserve"> </w:t>
-      </w:r>
-      <w:r>
-        <w:rPr>
-          <w:i/>
-          <w:iCs/>
-        </w:rPr>
-        <w:t xml:space="preserve">2017), Thessaloniki, Greece, September 21st, 2017</w:t>
-      </w:r>
-      <w:r>
-        <w:t xml:space="preserve">, edited by Philipp Mayr, Douglas Tudhope, Koraljka Golub, Christian Wartena, and Ernesto William De Luca, 1937:14–25.</w:t>
-      </w:r>
-      <w:r>
-        <w:t xml:space="preserve"> </w:t>
-      </w:r>
-      <w:r>
-        <w:t xml:space="preserve">CEUR</w:t>
-      </w:r>
-      <w:r>
-        <w:t xml:space="preserve"> </w:t>
-      </w:r>
-      <w:r>
-        <w:t xml:space="preserve">Workshop Proceedings. CEUR-WS.org.</w:t>
-      </w:r>
-    </w:p>
-    <w:bookmarkEnd w:id="91"/>
-    <w:bookmarkStart w:id="93" w:name="ref-piscopoWhatWeTalk2019"/>
-    <w:p>
-      <w:pPr>
-        <w:pStyle w:val="Bibliography"/>
-      </w:pPr>
-      <w:r>
-        <w:t xml:space="preserve">Piscopo, Alessandro, and Elena Simperl. 2019.</w:t>
-      </w:r>
-      <w:r>
-        <w:t xml:space="preserve"> </w:t>
-      </w:r>
-      <w:r>
-        <w:t xml:space="preserve">“What We Talk about When We Talk about Wikidata Quality: A Literature Survey.”</w:t>
-      </w:r>
-      <w:r>
-        <w:t xml:space="preserve"> </w:t>
-      </w:r>
-      <w:r>
-        <w:t xml:space="preserve">In</w:t>
-      </w:r>
-      <w:r>
-        <w:t xml:space="preserve"> </w:t>
-      </w:r>
-      <w:r>
-        <w:rPr>
-          <w:i/>
-          <w:iCs/>
-        </w:rPr>
-        <w:t xml:space="preserve">Proceedings of the 15th</w:t>
-      </w:r>
-      <w:r>
-        <w:rPr>
-          <w:i/>
-          <w:iCs/>
-        </w:rPr>
-        <w:t xml:space="preserve"> </w:t>
-      </w:r>
-      <w:r>
-        <w:rPr>
-          <w:i/>
-          <w:iCs/>
-        </w:rPr>
-        <w:t xml:space="preserve">International Symposium</w:t>
-      </w:r>
-      <w:r>
-        <w:rPr>
-          <w:i/>
-          <w:iCs/>
-        </w:rPr>
-        <w:t xml:space="preserve"> </w:t>
-      </w:r>
-      <w:r>
-        <w:rPr>
-          <w:i/>
-          <w:iCs/>
-        </w:rPr>
-        <w:t xml:space="preserve">on</w:t>
-      </w:r>
-      <w:r>
-        <w:rPr>
-          <w:i/>
-          <w:iCs/>
-        </w:rPr>
-        <w:t xml:space="preserve"> </w:t>
-      </w:r>
-      <w:r>
-        <w:rPr>
-          <w:i/>
-          <w:iCs/>
-        </w:rPr>
-        <w:t xml:space="preserve">Open Collaboration</w:t>
-      </w:r>
-      <w:r>
-        <w:t xml:space="preserve">, 1–11. Sk</w:t>
-      </w:r>
-      <w:r>
-        <w:t xml:space="preserve">ö</w:t>
-      </w:r>
-      <w:r>
-        <w:t xml:space="preserve">vde Sweden: ACM.</w:t>
-      </w:r>
-      <w:r>
-        <w:t xml:space="preserve"> </w:t>
-      </w:r>
-      <w:hyperlink r:id="rId92">
-        <w:r>
-          <w:rPr>
-            <w:rStyle w:val="Hyperlink"/>
-          </w:rPr>
-          <w:t xml:space="preserve">https://doi.org/10.1145/3306446.3340822</w:t>
+        <w:t xml:space="preserve">in</w:t>
+      </w:r>
+      <w:r>
+        <w:t xml:space="preserve"> </w:t>
+      </w:r>
+      <w:r>
+        <w:t xml:space="preserve">Digital Humanities</w:t>
+      </w:r>
+      <w:r>
+        <w:t xml:space="preserve"> </w:t>
+      </w:r>
+      <w:r>
+        <w:t xml:space="preserve">Projects.”</w:t>
+      </w:r>
+      <w:r>
+        <w:t xml:space="preserve"> </w:t>
+      </w:r>
+      <w:r>
+        <w:rPr>
+          <w:i/>
+          <w:iCs/>
+        </w:rPr>
+        <w:t xml:space="preserve">Digital Scholarship in the Humanities</w:t>
+      </w:r>
+      <w:r>
+        <w:t xml:space="preserve"> </w:t>
+      </w:r>
+      <w:r>
+        <w:t xml:space="preserve">38 (2): 852–74.</w:t>
+      </w:r>
+      <w:r>
+        <w:t xml:space="preserve"> </w:t>
+      </w:r>
+      <w:hyperlink r:id="rId117">
+        <w:r>
+          <w:rPr>
+            <w:rStyle w:val="Hyperlink"/>
+          </w:rPr>
+          <w:t xml:space="preserve">https://doi.org/10.1093/llc/fqac083</w:t>
         </w:r>
       </w:hyperlink>
       <w:r>
         <w:t xml:space="preserve">.</w:t>
       </w:r>
     </w:p>
-    <w:bookmarkEnd w:id="93"/>
-    <w:bookmarkStart w:id="95" w:name="ref-sahle_2016"/>
-    <w:p>
-      <w:pPr>
-        <w:pStyle w:val="Bibliography"/>
-      </w:pPr>
-      <w:r>
-        <w:t xml:space="preserve">Sahle, Patrick. 2016.</w:t>
-      </w:r>
-      <w:r>
-        <w:t xml:space="preserve"> </w:t>
-      </w:r>
-      <w:r>
-        <w:t xml:space="preserve">“2. What Is a Scholarly Digital Edition?”</w:t>
-      </w:r>
-      <w:r>
-        <w:t xml:space="preserve"> In</w:t>
-      </w:r>
-      <w:r>
-        <w:t xml:space="preserve"> </w:t>
-      </w:r>
-      <w:r>
-        <w:rPr>
-          <w:i/>
-          <w:iCs/>
-        </w:rPr>
-        <w:t xml:space="preserve">Digital Scholarly Editing : Theories and Practices</w:t>
-      </w:r>
-      <w:r>
-        <w:t xml:space="preserve">, edited by Matthew James Driscoll and Elena Pierazzo, 19–39. Digital Humanities Series. Cambridge: Open Book Publishers.</w:t>
-      </w:r>
-      <w:r>
-        <w:t xml:space="preserve"> </w:t>
-      </w:r>
-      <w:hyperlink r:id="rId94">
-        <w:r>
-          <w:rPr>
-            <w:rStyle w:val="Hyperlink"/>
-          </w:rPr>
-          <w:t xml:space="preserve">https://books.openedition.org/obp/3397</w:t>
-        </w:r>
-      </w:hyperlink>
-      <w:r>
-        <w:t xml:space="preserve">.</w:t>
-      </w:r>
-    </w:p>
-    <w:bookmarkEnd w:id="95"/>
-    <w:bookmarkStart w:id="97" w:name="ref-Santos24"/>
-    <w:p>
-      <w:pPr>
-        <w:pStyle w:val="Bibliography"/>
-      </w:pPr>
-      <w:r>
-        <w:t xml:space="preserve">Santos, Veronica, Daniel Schwabe, and Sérgio Lifschitz. 2024.</w:t>
-      </w:r>
-      <w:r>
-        <w:t xml:space="preserve"> </w:t>
-      </w:r>
-      <w:r>
-        <w:t xml:space="preserve">“Can You Trust Wikidata?”</w:t>
-      </w:r>
-      <w:r>
-        <w:t xml:space="preserve"> </w:t>
-      </w:r>
-      <w:r>
-        <w:rPr>
-          <w:i/>
-          <w:iCs/>
-        </w:rPr>
-        <w:t xml:space="preserve">Semantic Web</w:t>
-      </w:r>
-      <w:r>
-        <w:t xml:space="preserve"> </w:t>
-      </w:r>
-      <w:r>
-        <w:t xml:space="preserve">15 (6): 2271–92.</w:t>
-      </w:r>
-      <w:r>
-        <w:t xml:space="preserve"> </w:t>
-      </w:r>
-      <w:hyperlink r:id="rId96">
-        <w:r>
-          <w:rPr>
-            <w:rStyle w:val="Hyperlink"/>
-          </w:rPr>
-          <w:t xml:space="preserve">https://doi.org/10.3233/SW-243577</w:t>
-        </w:r>
-      </w:hyperlink>
-      <w:r>
-        <w:t xml:space="preserve">.</w:t>
-      </w:r>
-    </w:p>
-    <w:bookmarkEnd w:id="97"/>
-    <w:bookmarkStart w:id="99" w:name="X93500824e1a35d805803df92d9307dfab0955c0"/>
-    <w:p>
-      <w:pPr>
-        <w:pStyle w:val="Bibliography"/>
-      </w:pPr>
-      <w:r>
-        <w:t xml:space="preserve">Severo, Marta. 2021.</w:t>
-      </w:r>
-      <w:r>
-        <w:t xml:space="preserve"> </w:t>
-      </w:r>
-      <w:r>
-        <w:rPr>
-          <w:i/>
-          <w:iCs/>
-        </w:rPr>
-        <w:t xml:space="preserve">L’imp</w:t>
-      </w:r>
-      <w:r>
-        <w:rPr>
-          <w:i/>
-          <w:iCs/>
-        </w:rPr>
-        <w:t xml:space="preserve">é</w:t>
-      </w:r>
-      <w:r>
-        <w:rPr>
-          <w:i/>
-          <w:iCs/>
-        </w:rPr>
-        <w:t xml:space="preserve">ratif participatif: Institutions culturelles, amateurs et plateformes</w:t>
-      </w:r>
-      <w:r>
-        <w:t xml:space="preserve">. Bry-sur-Marne: Institut National de l’Audiovisuel (INA).</w:t>
-      </w:r>
-      <w:r>
-        <w:t xml:space="preserve"> </w:t>
-      </w:r>
-      <w:hyperlink r:id="rId98">
-        <w:r>
-          <w:rPr>
-            <w:rStyle w:val="Hyperlink"/>
-          </w:rPr>
-          <w:t xml:space="preserve">https://doi.org/10.3917/ina.sever.2021.01</w:t>
-        </w:r>
-      </w:hyperlink>
-      <w:r>
-        <w:t xml:space="preserve">.</w:t>
-      </w:r>
-    </w:p>
-    <w:bookmarkEnd w:id="99"/>
-    <w:bookmarkStart w:id="101" w:name="ref-shenoyStudyQualityWikidata2022"/>
-    <w:p>
-      <w:pPr>
-        <w:pStyle w:val="Bibliography"/>
-      </w:pPr>
-      <w:r>
-        <w:t xml:space="preserve">Shenoy, Kartik, Filip Ilievski, Daniel Garijo, Daniel Schwabe, and Pedro Szekely. 2022.</w:t>
-      </w:r>
-      <w:r>
-        <w:t xml:space="preserve"> </w:t>
-      </w:r>
-      <w:r>
-        <w:t xml:space="preserve">“A</w:t>
-      </w:r>
-      <w:r>
-        <w:t xml:space="preserve"> </w:t>
-      </w:r>
-      <w:r>
-        <w:t xml:space="preserve">Study</w:t>
-      </w:r>
-      <w:r>
-        <w:t xml:space="preserve"> </w:t>
-      </w:r>
-      <w:r>
-        <w:t xml:space="preserve">of the</w:t>
-      </w:r>
-      <w:r>
-        <w:t xml:space="preserve"> </w:t>
-      </w:r>
-      <w:r>
-        <w:t xml:space="preserve">Quality</w:t>
-      </w:r>
-      <w:r>
-        <w:t xml:space="preserve"> </w:t>
-      </w:r>
-      <w:r>
-        <w:t xml:space="preserve">of</w:t>
-      </w:r>
-      <w:r>
-        <w:t xml:space="preserve"> </w:t>
-      </w:r>
-      <w:r>
-        <w:t xml:space="preserve">Wikidata</w:t>
-      </w:r>
-      <w:r>
-        <w:t xml:space="preserve">.”</w:t>
-      </w:r>
-      <w:r>
-        <w:t xml:space="preserve"> </w:t>
-      </w:r>
-      <w:r>
-        <w:rPr>
-          <w:i/>
-          <w:iCs/>
-        </w:rPr>
-        <w:t xml:space="preserve">Journal of Web Semantics</w:t>
-      </w:r>
-      <w:r>
-        <w:t xml:space="preserve"> </w:t>
-      </w:r>
-      <w:r>
-        <w:t xml:space="preserve">72:100679.</w:t>
-      </w:r>
-      <w:r>
-        <w:t xml:space="preserve"> </w:t>
-      </w:r>
-      <w:hyperlink r:id="rId100">
-        <w:r>
-          <w:rPr>
-            <w:rStyle w:val="Hyperlink"/>
-          </w:rPr>
-          <w:t xml:space="preserve">https://doi.org/10.1016/j.websem.2021.100679</w:t>
-        </w:r>
-      </w:hyperlink>
-      <w:r>
-        <w:t xml:space="preserve">.</w:t>
-      </w:r>
-    </w:p>
-    <w:bookmarkEnd w:id="101"/>
-    <w:bookmarkStart w:id="102" w:name="ref-surowieckiWisdomCrowdsWhy2004"/>
-    <w:p>
-      <w:pPr>
-        <w:pStyle w:val="Bibliography"/>
-      </w:pPr>
-      <w:r>
-        <w:t xml:space="preserve">Surowiecki, James. 2004.</w:t>
-      </w:r>
-      <w:r>
-        <w:t xml:space="preserve"> </w:t>
-      </w:r>
-      <w:r>
-        <w:rPr>
-          <w:i/>
-          <w:iCs/>
-        </w:rPr>
-        <w:t xml:space="preserve">The</w:t>
-      </w:r>
-      <w:r>
-        <w:rPr>
-          <w:i/>
-          <w:iCs/>
-        </w:rPr>
-        <w:t xml:space="preserve"> </w:t>
-      </w:r>
-      <w:r>
-        <w:rPr>
-          <w:i/>
-          <w:iCs/>
-        </w:rPr>
-        <w:t xml:space="preserve">Wisdom</w:t>
-      </w:r>
-      <w:r>
-        <w:rPr>
-          <w:i/>
-          <w:iCs/>
-        </w:rPr>
-        <w:t xml:space="preserve"> </w:t>
-      </w:r>
-      <w:r>
-        <w:rPr>
-          <w:i/>
-          <w:iCs/>
-        </w:rPr>
-        <w:t xml:space="preserve">of</w:t>
-      </w:r>
-      <w:r>
-        <w:rPr>
-          <w:i/>
-          <w:iCs/>
-        </w:rPr>
-        <w:t xml:space="preserve"> </w:t>
-      </w:r>
-      <w:r>
-        <w:rPr>
-          <w:i/>
-          <w:iCs/>
-        </w:rPr>
-        <w:t xml:space="preserve">Crowds</w:t>
-      </w:r>
-      <w:r>
-        <w:rPr>
-          <w:i/>
-          <w:iCs/>
-        </w:rPr>
-        <w:t xml:space="preserve">:</w:t>
-      </w:r>
-      <w:r>
-        <w:rPr>
-          <w:i/>
-          <w:iCs/>
-        </w:rPr>
-        <w:t xml:space="preserve"> </w:t>
-      </w:r>
-      <w:r>
-        <w:rPr>
-          <w:i/>
-          <w:iCs/>
-        </w:rPr>
-        <w:t xml:space="preserve">Why</w:t>
-      </w:r>
-      <w:r>
-        <w:rPr>
-          <w:i/>
-          <w:iCs/>
-        </w:rPr>
-        <w:t xml:space="preserve"> </w:t>
-      </w:r>
-      <w:r>
-        <w:rPr>
-          <w:i/>
-          <w:iCs/>
-        </w:rPr>
-        <w:t xml:space="preserve">the</w:t>
-      </w:r>
-      <w:r>
-        <w:rPr>
-          <w:i/>
-          <w:iCs/>
-        </w:rPr>
-        <w:t xml:space="preserve"> </w:t>
-      </w:r>
-      <w:r>
-        <w:rPr>
-          <w:i/>
-          <w:iCs/>
-        </w:rPr>
-        <w:t xml:space="preserve">Many</w:t>
-      </w:r>
-      <w:r>
-        <w:rPr>
-          <w:i/>
-          <w:iCs/>
-        </w:rPr>
-        <w:t xml:space="preserve"> </w:t>
-      </w:r>
-      <w:r>
-        <w:rPr>
-          <w:i/>
-          <w:iCs/>
-        </w:rPr>
-        <w:t xml:space="preserve">Are</w:t>
-      </w:r>
-      <w:r>
-        <w:rPr>
-          <w:i/>
-          <w:iCs/>
-        </w:rPr>
-        <w:t xml:space="preserve"> </w:t>
-      </w:r>
-      <w:r>
-        <w:rPr>
-          <w:i/>
-          <w:iCs/>
-        </w:rPr>
-        <w:t xml:space="preserve">Smarter</w:t>
-      </w:r>
-      <w:r>
-        <w:rPr>
-          <w:i/>
-          <w:iCs/>
-        </w:rPr>
-        <w:t xml:space="preserve"> </w:t>
-      </w:r>
-      <w:r>
-        <w:rPr>
-          <w:i/>
-          <w:iCs/>
-        </w:rPr>
-        <w:t xml:space="preserve">Than the</w:t>
-      </w:r>
-      <w:r>
-        <w:rPr>
-          <w:i/>
-          <w:iCs/>
-        </w:rPr>
-        <w:t xml:space="preserve"> </w:t>
-      </w:r>
-      <w:r>
-        <w:rPr>
-          <w:i/>
-          <w:iCs/>
-        </w:rPr>
-        <w:t xml:space="preserve">Few</w:t>
-      </w:r>
-      <w:r>
-        <w:rPr>
-          <w:i/>
-          <w:iCs/>
-        </w:rPr>
-        <w:t xml:space="preserve"> </w:t>
-      </w:r>
-      <w:r>
-        <w:rPr>
-          <w:i/>
-          <w:iCs/>
-        </w:rPr>
-        <w:t xml:space="preserve">and How</w:t>
-      </w:r>
-      <w:r>
-        <w:rPr>
-          <w:i/>
-          <w:iCs/>
-        </w:rPr>
-        <w:t xml:space="preserve"> </w:t>
-      </w:r>
-      <w:r>
-        <w:rPr>
-          <w:i/>
-          <w:iCs/>
-        </w:rPr>
-        <w:t xml:space="preserve">Collective Wisdom Shapes Business</w:t>
-      </w:r>
-      <w:r>
-        <w:rPr>
-          <w:i/>
-          <w:iCs/>
-        </w:rPr>
-        <w:t xml:space="preserve">,</w:t>
-      </w:r>
-      <w:r>
-        <w:rPr>
-          <w:i/>
-          <w:iCs/>
-        </w:rPr>
-        <w:t xml:space="preserve"> </w:t>
-      </w:r>
-      <w:r>
-        <w:rPr>
-          <w:i/>
-          <w:iCs/>
-        </w:rPr>
-        <w:t xml:space="preserve">Economies</w:t>
-      </w:r>
-      <w:r>
-        <w:rPr>
-          <w:i/>
-          <w:iCs/>
-        </w:rPr>
-        <w:t xml:space="preserve">,</w:t>
-      </w:r>
-      <w:r>
-        <w:rPr>
-          <w:i/>
-          <w:iCs/>
-        </w:rPr>
-        <w:t xml:space="preserve"> </w:t>
-      </w:r>
-      <w:r>
-        <w:rPr>
-          <w:i/>
-          <w:iCs/>
-        </w:rPr>
-        <w:t xml:space="preserve">Societies</w:t>
-      </w:r>
-      <w:r>
-        <w:rPr>
-          <w:i/>
-          <w:iCs/>
-        </w:rPr>
-        <w:t xml:space="preserve">, and</w:t>
-      </w:r>
-      <w:r>
-        <w:rPr>
-          <w:i/>
-          <w:iCs/>
-        </w:rPr>
-        <w:t xml:space="preserve"> </w:t>
-      </w:r>
-      <w:r>
-        <w:rPr>
-          <w:i/>
-          <w:iCs/>
-        </w:rPr>
-        <w:t xml:space="preserve">Nations</w:t>
-      </w:r>
-      <w:r>
-        <w:t xml:space="preserve">. New York: Doubleday.</w:t>
-      </w:r>
-    </w:p>
-    <w:bookmarkEnd w:id="102"/>
-    <w:bookmarkStart w:id="104" w:name="Xc0c9be6670753b9e233d2ccaceb8f56b91b05f5"/>
-    <w:p>
-      <w:pPr>
-        <w:pStyle w:val="Bibliography"/>
-      </w:pPr>
-      <w:r>
-        <w:t xml:space="preserve">Thornton, Katherine, Kenneth Seals Nutt, and Anne Chen. 2024.</w:t>
-      </w:r>
-      <w:r>
-        <w:t xml:space="preserve"> </w:t>
-      </w:r>
-      <w:r>
-        <w:t xml:space="preserve">“Encoding</w:t>
-      </w:r>
-      <w:r>
-        <w:t xml:space="preserve"> </w:t>
-      </w:r>
-      <w:r>
-        <w:t xml:space="preserve">Archaeological Data Models</w:t>
-      </w:r>
-      <w:r>
-        <w:t xml:space="preserve"> </w:t>
-      </w:r>
-      <w:r>
-        <w:t xml:space="preserve">as</w:t>
-      </w:r>
-      <w:r>
-        <w:t xml:space="preserve"> </w:t>
-      </w:r>
-      <w:r>
-        <w:t xml:space="preserve">Wikidata Schemas</w:t>
-      </w:r>
-      <w:r>
-        <w:t xml:space="preserve">:</w:t>
-      </w:r>
-      <w:r>
-        <w:t xml:space="preserve"> </w:t>
-      </w:r>
-      <w:r>
-        <w:t xml:space="preserve">Utilizing Shape Expressions</w:t>
-      </w:r>
-      <w:r>
-        <w:t xml:space="preserve"> </w:t>
-      </w:r>
-      <w:r>
-        <w:t xml:space="preserve">to</w:t>
-      </w:r>
-      <w:r>
-        <w:t xml:space="preserve"> </w:t>
-      </w:r>
-      <w:r>
-        <w:t xml:space="preserve">Structure Collaborative Linked Open Data</w:t>
-      </w:r>
-      <w:r>
-        <w:t xml:space="preserve"> </w:t>
-      </w:r>
-      <w:r>
-        <w:t xml:space="preserve">for</w:t>
-      </w:r>
-      <w:r>
-        <w:t xml:space="preserve"> </w:t>
-      </w:r>
-      <w:r>
-        <w:t xml:space="preserve">Digital Storytelling Within</w:t>
-      </w:r>
-      <w:r>
-        <w:t xml:space="preserve"> </w:t>
-      </w:r>
-      <w:r>
-        <w:t xml:space="preserve">the</w:t>
-      </w:r>
-      <w:r>
-        <w:t xml:space="preserve"> </w:t>
-      </w:r>
-      <w:r>
-        <w:t xml:space="preserve">International Dura-Europos Archive</w:t>
-      </w:r>
-      <w:r>
-        <w:t xml:space="preserve">.”</w:t>
-      </w:r>
-      <w:r>
-        <w:t xml:space="preserve"> </w:t>
-      </w:r>
-      <w:r>
-        <w:rPr>
-          <w:i/>
-          <w:iCs/>
-        </w:rPr>
-        <w:t xml:space="preserve">The International Journal of Technology, Knowledge, and Society</w:t>
-      </w:r>
-      <w:r>
-        <w:t xml:space="preserve"> </w:t>
-      </w:r>
-      <w:r>
-        <w:t xml:space="preserve">21 (1): 69–83.</w:t>
-      </w:r>
-      <w:r>
-        <w:t xml:space="preserve"> </w:t>
-      </w:r>
-      <w:hyperlink r:id="rId103">
-        <w:r>
-          <w:rPr>
-            <w:rStyle w:val="Hyperlink"/>
-          </w:rPr>
-          <w:t xml:space="preserve">https://doi.org/10.18848/1832-3669/CGP/v21i01/69-83</w:t>
-        </w:r>
-      </w:hyperlink>
-      <w:r>
-        <w:t xml:space="preserve">.</w:t>
-      </w:r>
-    </w:p>
-    <w:bookmarkEnd w:id="104"/>
-    <w:bookmarkStart w:id="106" w:name="ref-thorntonUsingShapeExpressions2019"/>
-    <w:p>
-      <w:pPr>
-        <w:pStyle w:val="Bibliography"/>
-      </w:pPr>
-      <w:r>
-        <w:t xml:space="preserve">Thornton, Katherine, Harold Solbrig, Gregory S. Stupp, Jose Emilio Labra Gayo, Daniel Mietchen, Eric Prud’hommeaux, and Andra Waagmeester. 2019.</w:t>
-      </w:r>
-      <w:r>
-        <w:t xml:space="preserve"> </w:t>
-      </w:r>
-      <w:r>
-        <w:t xml:space="preserve">“Using</w:t>
-      </w:r>
-      <w:r>
-        <w:t xml:space="preserve"> </w:t>
-      </w:r>
-      <w:r>
-        <w:t xml:space="preserve">Shape Expressions</w:t>
-      </w:r>
-      <w:r>
-        <w:t xml:space="preserve"> </w:t>
-      </w:r>
-      <w:r>
-        <w:t xml:space="preserve">(</w:t>
-      </w:r>
-      <w:r>
-        <w:t xml:space="preserve">ShEx</w:t>
-      </w:r>
-      <w:r>
-        <w:t xml:space="preserve">) to</w:t>
-      </w:r>
-      <w:r>
-        <w:t xml:space="preserve"> </w:t>
-      </w:r>
-      <w:r>
-        <w:t xml:space="preserve">Share RDF Data Models</w:t>
-      </w:r>
-      <w:r>
-        <w:t xml:space="preserve"> </w:t>
-      </w:r>
-      <w:r>
-        <w:t xml:space="preserve">and to</w:t>
-      </w:r>
-      <w:r>
-        <w:t xml:space="preserve"> </w:t>
-      </w:r>
-      <w:r>
-        <w:t xml:space="preserve">Guide Curation</w:t>
-      </w:r>
-      <w:r>
-        <w:t xml:space="preserve"> </w:t>
-      </w:r>
-      <w:r>
-        <w:t xml:space="preserve">with</w:t>
-      </w:r>
-      <w:r>
-        <w:t xml:space="preserve"> </w:t>
-      </w:r>
-      <w:r>
-        <w:t xml:space="preserve">Rigorous Validation</w:t>
-      </w:r>
-      <w:r>
-        <w:t xml:space="preserve">.”</w:t>
-      </w:r>
-      <w:r>
-        <w:t xml:space="preserve"> </w:t>
-      </w:r>
-      <w:r>
-        <w:t xml:space="preserve">In</w:t>
-      </w:r>
-      <w:r>
-        <w:t xml:space="preserve"> </w:t>
-      </w:r>
-      <w:r>
-        <w:rPr>
-          <w:i/>
-          <w:iCs/>
-        </w:rPr>
-        <w:t xml:space="preserve">The</w:t>
-      </w:r>
-      <w:r>
-        <w:rPr>
-          <w:i/>
-          <w:iCs/>
-        </w:rPr>
-        <w:t xml:space="preserve"> </w:t>
-      </w:r>
-      <w:r>
-        <w:rPr>
-          <w:i/>
-          <w:iCs/>
-        </w:rPr>
-        <w:t xml:space="preserve">Semantic Web</w:t>
-      </w:r>
-      <w:r>
-        <w:t xml:space="preserve">, edited by Pascal Hitzler, Miriam Fernández, Krzysztof Janowicz, Amrapali Zaveri, Alasdair J. G. Gray, Vanessa Lopez, Armin Haller, and Karl Hammar, 11503:606–20. Cham: Springer International Publishing.</w:t>
-      </w:r>
-      <w:r>
-        <w:t xml:space="preserve"> </w:t>
-      </w:r>
-      <w:hyperlink r:id="rId105">
-        <w:r>
-          <w:rPr>
-            <w:rStyle w:val="Hyperlink"/>
-          </w:rPr>
-          <w:t xml:space="preserve">https://doi.org/10.1007/978-3-030-21348-0_39</w:t>
-        </w:r>
-      </w:hyperlink>
-      <w:r>
-        <w:t xml:space="preserve">.</w:t>
-      </w:r>
-    </w:p>
-    <w:bookmarkEnd w:id="106"/>
-    <w:bookmarkStart w:id="108" w:name="X76eaf9d9167b07f266dd857e10f7a7e0c6b1aac"/>
-    <w:p>
-      <w:pPr>
-        <w:pStyle w:val="Bibliography"/>
-      </w:pPr>
-      <w:r>
-        <w:t xml:space="preserve">Van Veen, Theo. 2019.</w:t>
-      </w:r>
-      <w:r>
-        <w:t xml:space="preserve"> </w:t>
-      </w:r>
-      <w:r>
-        <w:t xml:space="preserve">“Wikidata:</w:t>
-      </w:r>
-      <w:r>
-        <w:t xml:space="preserve"> </w:t>
-      </w:r>
-      <w:r>
-        <w:t xml:space="preserve">From</w:t>
-      </w:r>
-      <w:r>
-        <w:t xml:space="preserve"> </w:t>
-      </w:r>
-      <w:r>
-        <w:t xml:space="preserve">‘an’</w:t>
-      </w:r>
-      <w:r>
-        <w:t xml:space="preserve"> </w:t>
-      </w:r>
-      <w:r>
-        <w:t xml:space="preserve">Identifier</w:t>
-      </w:r>
-      <w:r>
-        <w:t xml:space="preserve"> </w:t>
-      </w:r>
-      <w:r>
-        <w:t xml:space="preserve">to</w:t>
-      </w:r>
-      <w:r>
-        <w:t xml:space="preserve"> </w:t>
-      </w:r>
-      <w:r>
-        <w:t xml:space="preserve">‘the’</w:t>
-      </w:r>
-      <w:r>
-        <w:t xml:space="preserve"> </w:t>
-      </w:r>
-      <w:r>
-        <w:t xml:space="preserve">Identifier</w:t>
-      </w:r>
-      <w:r>
-        <w:t xml:space="preserve">.”</w:t>
-      </w:r>
-      <w:r>
-        <w:t xml:space="preserve"> </w:t>
-      </w:r>
-      <w:r>
-        <w:rPr>
-          <w:i/>
-          <w:iCs/>
-        </w:rPr>
-        <w:t xml:space="preserve">Information Technology and Libraries</w:t>
-      </w:r>
-      <w:r>
-        <w:t xml:space="preserve"> </w:t>
-      </w:r>
-      <w:r>
-        <w:t xml:space="preserve">38 (2): 72–81.</w:t>
-      </w:r>
-      <w:r>
-        <w:t xml:space="preserve"> </w:t>
-      </w:r>
-      <w:hyperlink r:id="rId107">
-        <w:r>
-          <w:rPr>
-            <w:rStyle w:val="Hyperlink"/>
-          </w:rPr>
-          <w:t xml:space="preserve">https://doi.org/10.6017/ital.v38i2.10886</w:t>
-        </w:r>
-      </w:hyperlink>
-      <w:r>
-        <w:t xml:space="preserve">.</w:t>
-      </w:r>
-    </w:p>
-    <w:bookmarkEnd w:id="108"/>
-    <w:bookmarkStart w:id="110" w:name="ref-verstraete2024"/>
-    <w:p>
-      <w:pPr>
-        <w:pStyle w:val="Bibliography"/>
-      </w:pPr>
-      <w:r>
-        <w:t xml:space="preserve">Verstraete, Mathilde. 2024.</w:t>
-      </w:r>
-      <w:r>
-        <w:t xml:space="preserve"> </w:t>
-      </w:r>
-      <w:r>
-        <w:t xml:space="preserve">“Dynamiques auctoriales au sein du projet d’édition numérique collaborative de l’ Anthologie grecque.”</w:t>
-      </w:r>
-      <w:r>
-        <w:t xml:space="preserve"> </w:t>
-      </w:r>
-      <w:r>
-        <w:rPr>
-          <w:i/>
-          <w:iCs/>
-        </w:rPr>
-        <w:t xml:space="preserve">Sens Public</w:t>
-      </w:r>
-      <w:r>
-        <w:t xml:space="preserve">.</w:t>
-      </w:r>
-      <w:r>
-        <w:t xml:space="preserve"> </w:t>
-      </w:r>
-      <w:hyperlink r:id="rId109">
-        <w:r>
-          <w:rPr>
-            <w:rStyle w:val="Hyperlink"/>
-          </w:rPr>
-          <w:t xml:space="preserve">http://sens-public.org/articles/1692/</w:t>
-        </w:r>
-      </w:hyperlink>
-      <w:r>
-        <w:t xml:space="preserve">.</w:t>
-      </w:r>
-    </w:p>
-    <w:bookmarkEnd w:id="110"/>
-    <w:bookmarkStart w:id="111" w:name="X0f0dc6b5bb60387299ab4a121a7a3862e4c0b2a"/>
-    <w:p>
-      <w:pPr>
-        <w:pStyle w:val="Bibliography"/>
-      </w:pPr>
-      <w:r>
-        <w:t xml:space="preserve">Verstraete, Mathilde, and Margot Mellet. 2024.</w:t>
-      </w:r>
-      <w:r>
-        <w:t xml:space="preserve"> </w:t>
-      </w:r>
-      <w:r>
-        <w:t xml:space="preserve">“</w:t>
-      </w:r>
-      <w:r>
-        <w:t xml:space="preserve">Pass</w:t>
-      </w:r>
-      <w:r>
-        <w:t xml:space="preserve">é</w:t>
-      </w:r>
-      <w:r>
-        <w:t xml:space="preserve">s et pr</w:t>
-      </w:r>
-      <w:r>
-        <w:t xml:space="preserve">é</w:t>
-      </w:r>
-      <w:r>
-        <w:t xml:space="preserve">sents anthologiques. Le projet d’</w:t>
-      </w:r>
-      <w:r>
-        <w:t xml:space="preserve">é</w:t>
-      </w:r>
-      <w:r>
-        <w:t xml:space="preserve">dition num</w:t>
-      </w:r>
-      <w:r>
-        <w:t xml:space="preserve">é</w:t>
-      </w:r>
-      <w:r>
-        <w:t xml:space="preserve">rique collaborative de l’Anthologie grecque</w:t>
-      </w:r>
-      <w:r>
-        <w:t xml:space="preserve">.”</w:t>
-      </w:r>
-      <w:r>
-        <w:t xml:space="preserve"> </w:t>
-      </w:r>
-      <w:r>
-        <w:t xml:space="preserve">In</w:t>
-      </w:r>
-      <w:r>
-        <w:t xml:space="preserve"> </w:t>
-      </w:r>
-      <w:r>
-        <w:rPr>
-          <w:i/>
-          <w:iCs/>
-        </w:rPr>
-        <w:t xml:space="preserve">Communaut</w:t>
-      </w:r>
-      <w:r>
-        <w:rPr>
-          <w:i/>
-          <w:iCs/>
-        </w:rPr>
-        <w:t xml:space="preserve">é</w:t>
-      </w:r>
-      <w:r>
-        <w:rPr>
-          <w:i/>
-          <w:iCs/>
-        </w:rPr>
-        <w:t xml:space="preserve">s et pratiques d’</w:t>
-      </w:r>
-      <w:r>
-        <w:rPr>
-          <w:i/>
-          <w:iCs/>
-        </w:rPr>
-        <w:t xml:space="preserve">é</w:t>
-      </w:r>
-      <w:r>
-        <w:rPr>
-          <w:i/>
-          <w:iCs/>
-        </w:rPr>
-        <w:t xml:space="preserve">critures des patrimoines et des m</w:t>
-      </w:r>
-      <w:r>
-        <w:rPr>
-          <w:i/>
-          <w:iCs/>
-        </w:rPr>
-        <w:t xml:space="preserve">é</w:t>
-      </w:r>
-      <w:r>
-        <w:rPr>
-          <w:i/>
-          <w:iCs/>
-        </w:rPr>
-        <w:t xml:space="preserve">moires</w:t>
-      </w:r>
-      <w:r>
-        <w:t xml:space="preserve">, Presses universitaires de Paris-Nanterre. Paris.</w:t>
-      </w:r>
-    </w:p>
-    <w:bookmarkEnd w:id="111"/>
-    <w:bookmarkStart w:id="112" w:name="X49b7f14284e5c85b05ed9ef488a8af1746e486f"/>
-    <w:p>
-      <w:pPr>
-        <w:pStyle w:val="Bibliography"/>
-      </w:pPr>
-      <w:r>
-        <w:t xml:space="preserve">Vitali-Rosati, Marcello, Margot Mellet, Servanne Monjour, Antoine Fauchié, Timothée Guicherd, David Larlet, and Enrico Agostini-Marchese. 2021.</w:t>
-      </w:r>
-      <w:r>
-        <w:t xml:space="preserve"> </w:t>
-      </w:r>
-      <w:r>
-        <w:t xml:space="preserve">“</w:t>
-      </w:r>
-      <w:r>
-        <w:t xml:space="preserve">L’</w:t>
-      </w:r>
-      <w:r>
-        <w:t xml:space="preserve">é</w:t>
-      </w:r>
-      <w:r>
-        <w:t xml:space="preserve">pop</w:t>
-      </w:r>
-      <w:r>
-        <w:t xml:space="preserve">é</w:t>
-      </w:r>
-      <w:r>
-        <w:t xml:space="preserve">e num</w:t>
-      </w:r>
-      <w:r>
-        <w:t xml:space="preserve">é</w:t>
-      </w:r>
-      <w:r>
-        <w:t xml:space="preserve">rique de l’Anthologie grecque : entre questions</w:t>
-      </w:r>
-      <w:r>
-        <w:t xml:space="preserve"> </w:t>
-      </w:r>
-      <w:r>
-        <w:t xml:space="preserve">é</w:t>
-      </w:r>
-      <w:r>
-        <w:t xml:space="preserve">pist</w:t>
-      </w:r>
-      <w:r>
-        <w:t xml:space="preserve">é</w:t>
-      </w:r>
-      <w:r>
-        <w:t xml:space="preserve">mologiques, mod</w:t>
-      </w:r>
-      <w:r>
-        <w:t xml:space="preserve">è</w:t>
-      </w:r>
-      <w:r>
-        <w:t xml:space="preserve">les techniques et dynamiques collaboratives</w:t>
-      </w:r>
-      <w:r>
-        <w:t xml:space="preserve">.”</w:t>
-      </w:r>
-      <w:r>
-        <w:t xml:space="preserve"> </w:t>
-      </w:r>
-      <w:r>
-        <w:rPr>
-          <w:i/>
-          <w:iCs/>
-        </w:rPr>
-        <w:t xml:space="preserve">Sens Public</w:t>
-      </w:r>
-      <w:r>
-        <w:t xml:space="preserve">, July.</w:t>
-      </w:r>
-    </w:p>
-    <w:bookmarkEnd w:id="112"/>
-    <w:bookmarkStart w:id="113" w:name="X7bd1d176aee6bc7ccd1de56ac79c4c1564d8a12"/>
-    <w:p>
-      <w:pPr>
-        <w:pStyle w:val="Bibliography"/>
-      </w:pPr>
-      <w:r>
-        <w:t xml:space="preserve">Vitali-Rosati, Marcello, Servanne Monjour, Joana Casenave, Elsa Bouchard, and Margot Mellet. 2020.</w:t>
-      </w:r>
-      <w:r>
-        <w:t xml:space="preserve"> </w:t>
-      </w:r>
-      <w:r>
-        <w:t xml:space="preserve">“Editorializing the</w:t>
-      </w:r>
-      <w:r>
-        <w:t xml:space="preserve"> </w:t>
-      </w:r>
-      <w:r>
-        <w:t xml:space="preserve">Greek Anthology</w:t>
-      </w:r>
-      <w:r>
-        <w:t xml:space="preserve">:</w:t>
-      </w:r>
-      <w:r>
-        <w:t xml:space="preserve"> </w:t>
-      </w:r>
-      <w:r>
-        <w:t xml:space="preserve">The</w:t>
-      </w:r>
-      <w:r>
-        <w:t xml:space="preserve"> </w:t>
-      </w:r>
-      <w:r>
-        <w:t xml:space="preserve">Palatin Manuscript as a Collective Imaginary.”</w:t>
-      </w:r>
-      <w:r>
-        <w:t xml:space="preserve"> </w:t>
-      </w:r>
-      <w:r>
-        <w:rPr>
-          <w:i/>
-          <w:iCs/>
-        </w:rPr>
-        <w:t xml:space="preserve">Digital Humanities Quarterly</w:t>
-      </w:r>
-      <w:r>
-        <w:t xml:space="preserve"> </w:t>
-      </w:r>
-      <w:r>
-        <w:t xml:space="preserve">014 (1).</w:t>
-      </w:r>
-    </w:p>
-    <w:bookmarkEnd w:id="113"/>
-    <w:bookmarkStart w:id="115" w:name="ref-waltz_anthologie_1931"/>
-    <w:p>
-      <w:pPr>
-        <w:pStyle w:val="Bibliography"/>
-      </w:pPr>
-      <w:r>
-        <w:t xml:space="preserve">Waltz, Pierre. 1931.</w:t>
-      </w:r>
-      <w:r>
-        <w:t xml:space="preserve"> </w:t>
-      </w:r>
-      <w:r>
-        <w:rPr>
-          <w:i/>
-          <w:iCs/>
-        </w:rPr>
-        <w:t xml:space="preserve">Anthologie Grecque. T.</w:t>
-      </w:r>
-      <w:r>
-        <w:rPr>
-          <w:i/>
-          <w:iCs/>
-        </w:rPr>
-        <w:t xml:space="preserve"> </w:t>
-      </w:r>
-      <w:r>
-        <w:rPr>
-          <w:i/>
-          <w:iCs/>
-        </w:rPr>
-        <w:t xml:space="preserve">III</w:t>
-      </w:r>
-      <w:r>
-        <w:t xml:space="preserve">. Vol. III. Budé. Paris: Les Belles Lettres.</w:t>
-      </w:r>
-      <w:r>
-        <w:t xml:space="preserve"> </w:t>
-      </w:r>
-      <w:hyperlink r:id="rId114">
-        <w:r>
-          <w:rPr>
-            <w:rStyle w:val="Hyperlink"/>
-          </w:rPr>
-          <w:t xml:space="preserve">https://archive.org/details/anthologiegrecqu0000unse_l9e5/page/n3/mode/2up</w:t>
-        </w:r>
-      </w:hyperlink>
-      <w:r>
-        <w:t xml:space="preserve">.</w:t>
-      </w:r>
-    </w:p>
-    <w:bookmarkEnd w:id="115"/>
-    <w:bookmarkStart w:id="117" w:name="ref-waltz_anthologie_1960"/>
-    <w:p>
-      <w:pPr>
-        <w:pStyle w:val="Bibliography"/>
-      </w:pPr>
-      <w:r>
-        <w:t xml:space="preserve">———. 1960.</w:t>
-      </w:r>
-      <w:r>
-        <w:t xml:space="preserve"> </w:t>
-      </w:r>
-      <w:r>
-        <w:rPr>
-          <w:i/>
-          <w:iCs/>
-        </w:rPr>
-        <w:t xml:space="preserve">Anthologie Grecque. T. V</w:t>
-      </w:r>
-      <w:r>
-        <w:t xml:space="preserve">. Translated by Edouard Des Places, M. Dumitrescu, H. Le Maitre, and G. Soury. Vol. V. Budé. Paris: Les Belles Lettres.</w:t>
-      </w:r>
-      <w:r>
-        <w:t xml:space="preserve"> </w:t>
-      </w:r>
-      <w:hyperlink r:id="rId116">
-        <w:r>
-          <w:rPr>
-            <w:rStyle w:val="Hyperlink"/>
-          </w:rPr>
-          <w:t xml:space="preserve">https://archive.org/details/anthologiegrecqu0000unse_i9t4</w:t>
-        </w:r>
-      </w:hyperlink>
-      <w:r>
-        <w:t xml:space="preserve">.</w:t>
-      </w:r>
-    </w:p>
-    <w:bookmarkEnd w:id="117"/>
-    <w:bookmarkStart w:id="119" w:name="ref-waltz_anthologie_1974"/>
-    <w:p>
-      <w:pPr>
-        <w:pStyle w:val="Bibliography"/>
-      </w:pPr>
-      <w:r>
-        <w:t xml:space="preserve">———. 1974.</w:t>
-      </w:r>
-      <w:r>
-        <w:t xml:space="preserve"> </w:t>
-      </w:r>
-      <w:r>
-        <w:rPr>
-          <w:i/>
-          <w:iCs/>
-        </w:rPr>
-        <w:t xml:space="preserve">Anthologie Grecque. T.</w:t>
-      </w:r>
-      <w:r>
-        <w:rPr>
-          <w:i/>
-          <w:iCs/>
-        </w:rPr>
-        <w:t xml:space="preserve"> </w:t>
-      </w:r>
-      <w:r>
-        <w:rPr>
-          <w:i/>
-          <w:iCs/>
-        </w:rPr>
-        <w:t xml:space="preserve">VIII</w:t>
-      </w:r>
-      <w:r>
-        <w:t xml:space="preserve">. Edited by Jean Irigoin, Pierre Laurens, and G. Soury. Vol. VIII. Budé. Paris: Les Belles Lettres.</w:t>
-      </w:r>
-      <w:r>
-        <w:t xml:space="preserve"> </w:t>
-      </w:r>
-      <w:hyperlink r:id="rId118">
-        <w:r>
-          <w:rPr>
-            <w:rStyle w:val="Hyperlink"/>
-          </w:rPr>
-          <w:t xml:space="preserve">https://archive.org/details/anthologiegrecqu0008unse</w:t>
-        </w:r>
-      </w:hyperlink>
-      <w:r>
-        <w:t xml:space="preserve">.</w:t>
-      </w:r>
-    </w:p>
+    <w:bookmarkEnd w:id="118"/>
     <w:bookmarkEnd w:id="119"/>
-    <w:bookmarkStart w:id="120" w:name="ref-waltz_anthologie_2003"/>
-    <w:p>
-      <w:pPr>
-        <w:pStyle w:val="Bibliography"/>
-      </w:pPr>
-      <w:r>
-        <w:t xml:space="preserve">———. 2003.</w:t>
-      </w:r>
-      <w:r>
-        <w:t xml:space="preserve"> </w:t>
-      </w:r>
-      <w:r>
-        <w:rPr>
-          <w:i/>
-          <w:iCs/>
-        </w:rPr>
-        <w:t xml:space="preserve">Anthologie Grecque. T.</w:t>
-      </w:r>
-      <w:r>
-        <w:rPr>
-          <w:i/>
-          <w:iCs/>
-        </w:rPr>
-        <w:t xml:space="preserve"> </w:t>
-      </w:r>
-      <w:r>
-        <w:rPr>
-          <w:i/>
-          <w:iCs/>
-        </w:rPr>
-        <w:t xml:space="preserve">II</w:t>
-      </w:r>
-      <w:r>
-        <w:t xml:space="preserve">. Edited by Jean Irigoin. Vol. II. Budé. Paris: Les Belles Lettres.</w:t>
-      </w:r>
-    </w:p>
     <w:bookmarkEnd w:id="120"/>
-    <w:bookmarkStart w:id="121" w:name="ref-waltz_anthologie_1929"/>
-    <w:p>
-      <w:pPr>
-        <w:pStyle w:val="Bibliography"/>
-      </w:pPr>
-      <w:r>
-        <w:t xml:space="preserve">Waltz, Pierre, Jean Guillon, Jean Irigoin, P. Camelot, Alphonse Dain, Edouard Des Places, A.-M. Desrousseaux, et al. 1929–1994.</w:t>
-      </w:r>
-      <w:r>
-        <w:t xml:space="preserve"> </w:t>
-      </w:r>
-      <w:r>
-        <w:rPr>
-          <w:i/>
-          <w:iCs/>
-        </w:rPr>
-        <w:t xml:space="preserve">Anthologie Grecque</w:t>
-      </w:r>
-      <w:r>
-        <w:t xml:space="preserve">. Vol. I–XIII. XIII vols. Budé. Paris: Les Belles Lettres.</w:t>
-      </w:r>
-    </w:p>
-    <w:bookmarkEnd w:id="121"/>
-    <w:bookmarkStart w:id="123" w:name="ref-zhaoSystematicReviewWikidata2023"/>
-    <w:p>
-      <w:pPr>
-        <w:pStyle w:val="Bibliography"/>
-      </w:pPr>
-      <w:r>
-        <w:t xml:space="preserve">Zhao, Fudie. 2023.</w:t>
-      </w:r>
-      <w:r>
-        <w:t xml:space="preserve"> </w:t>
-      </w:r>
-      <w:r>
-        <w:t xml:space="preserve">“A Systematic Review of</w:t>
-      </w:r>
-      <w:r>
-        <w:t xml:space="preserve"> </w:t>
-      </w:r>
-      <w:r>
-        <w:t xml:space="preserve">Wikidata</w:t>
-      </w:r>
-      <w:r>
-        <w:t xml:space="preserve"> </w:t>
-      </w:r>
-      <w:r>
-        <w:t xml:space="preserve">in</w:t>
-      </w:r>
-      <w:r>
-        <w:t xml:space="preserve"> </w:t>
-      </w:r>
-      <w:r>
-        <w:t xml:space="preserve">Digital Humanities</w:t>
-      </w:r>
-      <w:r>
-        <w:t xml:space="preserve"> </w:t>
-      </w:r>
-      <w:r>
-        <w:t xml:space="preserve">Projects.”</w:t>
-      </w:r>
-      <w:r>
-        <w:t xml:space="preserve"> </w:t>
-      </w:r>
-      <w:r>
-        <w:rPr>
-          <w:i/>
-          <w:iCs/>
-        </w:rPr>
-        <w:t xml:space="preserve">Digital Scholarship in the Humanities</w:t>
-      </w:r>
-      <w:r>
-        <w:t xml:space="preserve"> </w:t>
-      </w:r>
-      <w:r>
-        <w:t xml:space="preserve">38 (2): 852–74.</w:t>
-      </w:r>
-      <w:r>
-        <w:t xml:space="preserve"> </w:t>
-      </w:r>
-      <w:hyperlink r:id="rId122">
-        <w:r>
-          <w:rPr>
-            <w:rStyle w:val="Hyperlink"/>
-          </w:rPr>
-          <w:t xml:space="preserve">https://doi.org/10.1093/llc/fqac083</w:t>
-        </w:r>
-      </w:hyperlink>
-      <w:r>
-        <w:t xml:space="preserve">.</w:t>
-      </w:r>
-    </w:p>
-    <w:bookmarkEnd w:id="123"/>
-    <w:bookmarkEnd w:id="124"/>
-    <w:bookmarkEnd w:id="125"/>
     <w:sectPr/>
   </w:body>
 </w:document>

</xml_diff>

<commit_message>
correction references, ajout bio auteurs et information csv
</commit_message>
<xml_diff>
--- a/Papier/Papier.docx
+++ b/Papier/Papier.docx
@@ -698,20 +698,7 @@
         <w:t xml:space="preserve"> </w:t>
       </w:r>
       <w:r>
-        <w:t xml:space="preserve">(Verstraete and Mellet 2024; Verstraete 2024; Vitali-Rosati et al. 2021; Mellet 2020;</w:t>
-      </w:r>
-      <w:r>
-        <w:t xml:space="preserve"> </w:t>
-      </w:r>
-      <w:r>
-        <w:rPr>
-          <w:b/>
-          <w:bCs/>
-        </w:rPr>
-        <w:t xml:space="preserve">vitali-rosatiEditorializingGreekAnthology2020?</w:t>
-      </w:r>
-      <w:r>
-        <w:t xml:space="preserve">)</w:t>
+        <w:t xml:space="preserve">(Verstraete and Mellet 2024; Verstraete 2024; Vitali-Rosati et al. 2021; Mellet 2020; Vitali-Rosati et al. 2020)</w:t>
       </w:r>
       <w:r>
         <w:t xml:space="preserve">. The project was born out of the need to index and render accessible this foundational corpus, which gathers nearly all the known epigrams of ancient Greek literature. From the beginning, the aim was not only to provide access to these texts, but also to experiment with a digital editorial model suited to their fragmentary nature and complex transmission history.</w:t>
@@ -1104,17 +1091,7 @@
         <w:t xml:space="preserve"> </w:t>
       </w:r>
       <w:r>
-        <w:t xml:space="preserve">(</w:t>
-      </w:r>
-      <w:r>
-        <w:rPr>
-          <w:b/>
-          <w:bCs/>
-        </w:rPr>
-        <w:t xml:space="preserve">gow_greek_1965?</w:t>
-      </w:r>
-      <w:r>
-        <w:t xml:space="preserve">)</w:t>
+        <w:t xml:space="preserve">(Gow and Page 1965, 2:464–75)</w:t>
       </w:r>
       <w:r>
         <w:t xml:space="preserve">, as well as in the Budé edition</w:t>
@@ -1358,17 +1335,7 @@
         <w:t xml:space="preserve"> </w:t>
       </w:r>
       <w:r>
-        <w:t xml:space="preserve">(</w:t>
-      </w:r>
-      <w:r>
-        <w:rPr>
-          <w:b/>
-          <w:bCs/>
-        </w:rPr>
-        <w:t xml:space="preserve">gow_greek_1965?</w:t>
-      </w:r>
-      <w:r>
-        <w:t xml:space="preserve">)</w:t>
+        <w:t xml:space="preserve">(Gow and Page 1965, 2:231)</w:t>
       </w:r>
       <w:r>
         <w:t xml:space="preserve"> </w:t>
@@ -1616,20 +1583,7 @@
         <w:t xml:space="preserve"> </w:t>
       </w:r>
       <w:r>
-        <w:t xml:space="preserve">(Waltz 2003, 141; 1931, 184; 1960, 175; 1974, 281;</w:t>
-      </w:r>
-      <w:r>
-        <w:t xml:space="preserve"> </w:t>
-      </w:r>
-      <w:r>
-        <w:rPr>
-          <w:b/>
-          <w:bCs/>
-        </w:rPr>
-        <w:t xml:space="preserve">irigoin_anthologie_2017?</w:t>
-      </w:r>
-      <w:r>
-        <w:t xml:space="preserve">; Aubreton 1980, XIII:302)</w:t>
+        <w:t xml:space="preserve">(Waltz 2003, 141; 1931, 184; 1960, 175; 1974, 281; Irigoin and Maltomini 2017, IX:69; Aubreton 1980, XIII:302)</w:t>
       </w:r>
       <w:r>
         <w:t xml:space="preserve">;</w:t>
@@ -1736,20 +1690,7 @@
         <w:t xml:space="preserve"> </w:t>
       </w:r>
       <w:r>
-        <w:t xml:space="preserve">(Waltz 1974, 281;</w:t>
-      </w:r>
-      <w:r>
-        <w:t xml:space="preserve"> </w:t>
-      </w:r>
-      <w:r>
-        <w:rPr>
-          <w:b/>
-          <w:bCs/>
-        </w:rPr>
-        <w:t xml:space="preserve">irigoin_anthologie_2017?</w:t>
-      </w:r>
-      <w:r>
-        <w:t xml:space="preserve">)</w:t>
+        <w:t xml:space="preserve">(Waltz 1974, 281; Irigoin and Maltomini 2017, IX:69)</w:t>
       </w:r>
       <w:r>
         <w:t xml:space="preserve">.</w:t>
@@ -1792,17 +1733,7 @@
         <w:t xml:space="preserve"> </w:t>
       </w:r>
       <w:r>
-        <w:t xml:space="preserve">(</w:t>
-      </w:r>
-      <w:r>
-        <w:rPr>
-          <w:b/>
-          <w:bCs/>
-        </w:rPr>
-        <w:t xml:space="preserve">gow_greek_1965?</w:t>
-      </w:r>
-      <w:r>
-        <w:t xml:space="preserve">)</w:t>
+        <w:t xml:space="preserve">(Gow and Page 1965, 2:434–35)</w:t>
       </w:r>
     </w:p>
     <w:p>
@@ -2217,7 +2148,7 @@
       </w:r>
     </w:p>
     <w:bookmarkEnd w:id="71"/>
-    <w:bookmarkStart w:id="120" w:name="references"/>
+    <w:bookmarkStart w:id="123" w:name="references"/>
     <w:p>
       <w:pPr>
         <w:pStyle w:val="Heading2"/>
@@ -2226,7 +2157,7 @@
         <w:t xml:space="preserve">References</w:t>
       </w:r>
     </w:p>
-    <w:bookmarkStart w:id="119" w:name="refs"/>
+    <w:bookmarkStart w:id="122" w:name="refs"/>
     <w:bookmarkStart w:id="72" w:name="ref-aubreton_anthologie_1980"/>
     <w:p>
       <w:pPr>
@@ -3047,12 +2978,58 @@
       </w:r>
     </w:p>
     <w:bookmarkEnd w:id="85"/>
-    <w:bookmarkStart w:id="86" w:name="ref-levyLintelligenceCollectivePour1994"/>
+    <w:bookmarkStart w:id="86" w:name="ref-gowGreekAnthologyHellenistic1965"/>
     <w:p>
       <w:pPr>
         <w:pStyle w:val="Bibliography"/>
       </w:pPr>
       <w:r>
+        <w:t xml:space="preserve">Gow, Andrew Sydenham Farrar, and Denys Lionel Page. 1965.</w:t>
+      </w:r>
+      <w:r>
+        <w:t xml:space="preserve"> </w:t>
+      </w:r>
+      <w:r>
+        <w:rPr>
+          <w:i/>
+          <w:iCs/>
+        </w:rPr>
+        <w:t xml:space="preserve">The Greek Anthology. Hellenistic Epigrams</w:t>
+      </w:r>
+      <w:r>
+        <w:t xml:space="preserve">. Vol. 2. Cambridge: Cambridge University Press.</w:t>
+      </w:r>
+    </w:p>
+    <w:bookmarkEnd w:id="86"/>
+    <w:bookmarkStart w:id="87" w:name="ref-irigoinAnthologieGrecqueTome2017"/>
+    <w:p>
+      <w:pPr>
+        <w:pStyle w:val="Bibliography"/>
+      </w:pPr>
+      <w:r>
+        <w:t xml:space="preserve">Irigoin, Jean, and Francesca Maltomini. 2017.</w:t>
+      </w:r>
+      <w:r>
+        <w:t xml:space="preserve"> </w:t>
+      </w:r>
+      <w:r>
+        <w:rPr>
+          <w:i/>
+          <w:iCs/>
+        </w:rPr>
+        <w:t xml:space="preserve">Anthologie Grecque. Tome IX: Anthologie Palatine, Livre X</w:t>
+      </w:r>
+      <w:r>
+        <w:t xml:space="preserve">. Translated by Pierre Laurens. 2nd ed. Vol. IX. XIII vols. Budé. Paris: Les Belles Lettres.</w:t>
+      </w:r>
+    </w:p>
+    <w:bookmarkEnd w:id="87"/>
+    <w:bookmarkStart w:id="88" w:name="ref-levyLintelligenceCollectivePour1994"/>
+    <w:p>
+      <w:pPr>
+        <w:pStyle w:val="Bibliography"/>
+      </w:pPr>
+      <w:r>
         <w:t xml:space="preserve">Lévy, Pierre. 1994.</w:t>
       </w:r>
       <w:r>
@@ -3075,8 +3052,8 @@
         <w:t xml:space="preserve">couverte.</w:t>
       </w:r>
     </w:p>
-    <w:bookmarkEnd w:id="86"/>
-    <w:bookmarkStart w:id="88" w:name="ref-mellet2020"/>
+    <w:bookmarkEnd w:id="88"/>
+    <w:bookmarkStart w:id="90" w:name="ref-mellet2020"/>
     <w:p>
       <w:pPr>
         <w:pStyle w:val="Bibliography"/>
@@ -3106,7 +3083,7 @@
       <w:r>
         <w:t xml:space="preserve">5 (1). https://doi.org/</w:t>
       </w:r>
-      <w:hyperlink r:id="rId87">
+      <w:hyperlink r:id="rId89">
         <w:r>
           <w:rPr>
             <w:rStyle w:val="Hyperlink"/>
@@ -3118,8 +3095,8 @@
         <w:t xml:space="preserve">.</w:t>
       </w:r>
     </w:p>
-    <w:bookmarkEnd w:id="88"/>
-    <w:bookmarkStart w:id="89" w:name="ref-neubertWikidataLinkingHub2017"/>
+    <w:bookmarkEnd w:id="90"/>
+    <w:bookmarkStart w:id="91" w:name="ref-neubertWikidataLinkingHub2017"/>
     <w:p>
       <w:pPr>
         <w:pStyle w:val="Bibliography"/>
@@ -3264,8 +3241,8 @@
         <w:t xml:space="preserve">Workshop Proceedings. CEUR-WS.org.</w:t>
       </w:r>
     </w:p>
-    <w:bookmarkEnd w:id="89"/>
-    <w:bookmarkStart w:id="91" w:name="ref-piscopoWhatWeTalk2019"/>
+    <w:bookmarkEnd w:id="91"/>
+    <w:bookmarkStart w:id="93" w:name="ref-piscopoWhatWeTalk2019"/>
     <w:p>
       <w:pPr>
         <w:pStyle w:val="Bibliography"/>
@@ -3349,7 +3326,7 @@
       <w:r>
         <w:t xml:space="preserve"> </w:t>
       </w:r>
-      <w:hyperlink r:id="rId90">
+      <w:hyperlink r:id="rId92">
         <w:r>
           <w:rPr>
             <w:rStyle w:val="Hyperlink"/>
@@ -3361,8 +3338,8 @@
         <w:t xml:space="preserve">.</w:t>
       </w:r>
     </w:p>
-    <w:bookmarkEnd w:id="91"/>
-    <w:bookmarkStart w:id="93" w:name="ref-sahle_2016"/>
+    <w:bookmarkEnd w:id="93"/>
+    <w:bookmarkStart w:id="95" w:name="ref-sahle_2016"/>
     <w:p>
       <w:pPr>
         <w:pStyle w:val="Bibliography"/>
@@ -3395,7 +3372,7 @@
       <w:r>
         <w:t xml:space="preserve"> </w:t>
       </w:r>
-      <w:hyperlink r:id="rId92">
+      <w:hyperlink r:id="rId94">
         <w:r>
           <w:rPr>
             <w:rStyle w:val="Hyperlink"/>
@@ -3407,8 +3384,8 @@
         <w:t xml:space="preserve">.</w:t>
       </w:r>
     </w:p>
-    <w:bookmarkEnd w:id="93"/>
-    <w:bookmarkStart w:id="95" w:name="ref-Santos24"/>
+    <w:bookmarkEnd w:id="95"/>
+    <w:bookmarkStart w:id="97" w:name="ref-Santos24"/>
     <w:p>
       <w:pPr>
         <w:pStyle w:val="Bibliography"/>
@@ -3441,7 +3418,7 @@
       <w:r>
         <w:t xml:space="preserve"> </w:t>
       </w:r>
-      <w:hyperlink r:id="rId94">
+      <w:hyperlink r:id="rId96">
         <w:r>
           <w:rPr>
             <w:rStyle w:val="Hyperlink"/>
@@ -3453,8 +3430,8 @@
         <w:t xml:space="preserve">.</w:t>
       </w:r>
     </w:p>
-    <w:bookmarkEnd w:id="95"/>
-    <w:bookmarkStart w:id="97" w:name="X93500824e1a35d805803df92d9307dfab0955c0"/>
+    <w:bookmarkEnd w:id="97"/>
+    <w:bookmarkStart w:id="99" w:name="X93500824e1a35d805803df92d9307dfab0955c0"/>
     <w:p>
       <w:pPr>
         <w:pStyle w:val="Bibliography"/>
@@ -3492,7 +3469,7 @@
       <w:r>
         <w:t xml:space="preserve"> </w:t>
       </w:r>
-      <w:hyperlink r:id="rId96">
+      <w:hyperlink r:id="rId98">
         <w:r>
           <w:rPr>
             <w:rStyle w:val="Hyperlink"/>
@@ -3504,8 +3481,8 @@
         <w:t xml:space="preserve">.</w:t>
       </w:r>
     </w:p>
-    <w:bookmarkEnd w:id="97"/>
-    <w:bookmarkStart w:id="99" w:name="ref-shenoyStudyQualityWikidata2022"/>
+    <w:bookmarkEnd w:id="99"/>
+    <w:bookmarkStart w:id="101" w:name="ref-shenoyStudyQualityWikidata2022"/>
     <w:p>
       <w:pPr>
         <w:pStyle w:val="Bibliography"/>
@@ -3571,7 +3548,7 @@
       <w:r>
         <w:t xml:space="preserve"> </w:t>
       </w:r>
-      <w:hyperlink r:id="rId98">
+      <w:hyperlink r:id="rId100">
         <w:r>
           <w:rPr>
             <w:rStyle w:val="Hyperlink"/>
@@ -3583,8 +3560,8 @@
         <w:t xml:space="preserve">.</w:t>
       </w:r>
     </w:p>
-    <w:bookmarkEnd w:id="99"/>
-    <w:bookmarkStart w:id="100" w:name="ref-surowieckiWisdomCrowdsWhy2004"/>
+    <w:bookmarkEnd w:id="101"/>
+    <w:bookmarkStart w:id="102" w:name="ref-surowieckiWisdomCrowdsWhy2004"/>
     <w:p>
       <w:pPr>
         <w:pStyle w:val="Bibliography"/>
@@ -3844,8 +3821,8 @@
         <w:t xml:space="preserve">. New York: Doubleday.</w:t>
       </w:r>
     </w:p>
-    <w:bookmarkEnd w:id="100"/>
-    <w:bookmarkStart w:id="102" w:name="Xc0c9be6670753b9e233d2ccaceb8f56b91b05f5"/>
+    <w:bookmarkEnd w:id="102"/>
+    <w:bookmarkStart w:id="104" w:name="Xc0c9be6670753b9e233d2ccaceb8f56b91b05f5"/>
     <w:p>
       <w:pPr>
         <w:pStyle w:val="Bibliography"/>
@@ -3944,7 +3921,7 @@
       <w:r>
         <w:t xml:space="preserve"> </w:t>
       </w:r>
-      <w:hyperlink r:id="rId101">
+      <w:hyperlink r:id="rId103">
         <w:r>
           <w:rPr>
             <w:rStyle w:val="Hyperlink"/>
@@ -3956,8 +3933,8 @@
         <w:t xml:space="preserve">.</w:t>
       </w:r>
     </w:p>
-    <w:bookmarkEnd w:id="102"/>
-    <w:bookmarkStart w:id="104" w:name="ref-thorntonUsingShapeExpressions2019"/>
+    <w:bookmarkEnd w:id="104"/>
+    <w:bookmarkStart w:id="106" w:name="ref-thorntonUsingShapeExpressions2019"/>
     <w:p>
       <w:pPr>
         <w:pStyle w:val="Bibliography"/>
@@ -4058,7 +4035,7 @@
       <w:r>
         <w:t xml:space="preserve"> </w:t>
       </w:r>
-      <w:hyperlink r:id="rId103">
+      <w:hyperlink r:id="rId105">
         <w:r>
           <w:rPr>
             <w:rStyle w:val="Hyperlink"/>
@@ -4070,8 +4047,8 @@
         <w:t xml:space="preserve">.</w:t>
       </w:r>
     </w:p>
-    <w:bookmarkEnd w:id="104"/>
-    <w:bookmarkStart w:id="106" w:name="X76eaf9d9167b07f266dd857e10f7a7e0c6b1aac"/>
+    <w:bookmarkEnd w:id="106"/>
+    <w:bookmarkStart w:id="108" w:name="X76eaf9d9167b07f266dd857e10f7a7e0c6b1aac"/>
     <w:p>
       <w:pPr>
         <w:pStyle w:val="Bibliography"/>
@@ -4143,7 +4120,7 @@
       <w:r>
         <w:t xml:space="preserve"> </w:t>
       </w:r>
-      <w:hyperlink r:id="rId105">
+      <w:hyperlink r:id="rId107">
         <w:r>
           <w:rPr>
             <w:rStyle w:val="Hyperlink"/>
@@ -4155,8 +4132,8 @@
         <w:t xml:space="preserve">.</w:t>
       </w:r>
     </w:p>
-    <w:bookmarkEnd w:id="106"/>
-    <w:bookmarkStart w:id="108" w:name="ref-verstraete2024"/>
+    <w:bookmarkEnd w:id="108"/>
+    <w:bookmarkStart w:id="110" w:name="ref-verstraete2024"/>
     <w:p>
       <w:pPr>
         <w:pStyle w:val="Bibliography"/>
@@ -4186,7 +4163,7 @@
       <w:r>
         <w:t xml:space="preserve"> </w:t>
       </w:r>
-      <w:hyperlink r:id="rId107">
+      <w:hyperlink r:id="rId109">
         <w:r>
           <w:rPr>
             <w:rStyle w:val="Hyperlink"/>
@@ -4198,8 +4175,8 @@
         <w:t xml:space="preserve">.</w:t>
       </w:r>
     </w:p>
-    <w:bookmarkEnd w:id="108"/>
-    <w:bookmarkStart w:id="109" w:name="X0f0dc6b5bb60387299ab4a121a7a3862e4c0b2a"/>
+    <w:bookmarkEnd w:id="110"/>
+    <w:bookmarkStart w:id="111" w:name="X0f0dc6b5bb60387299ab4a121a7a3862e4c0b2a"/>
     <w:p>
       <w:pPr>
         <w:pStyle w:val="Bibliography"/>
@@ -4233,8 +4210,8 @@
         <w:t xml:space="preserve">, edited by Nicolas Sauret and Marta Severo, 67–80. Paris: Presses universitaires de Paris-Nanterre.</w:t>
       </w:r>
     </w:p>
-    <w:bookmarkEnd w:id="109"/>
-    <w:bookmarkStart w:id="111" w:name="X49b7f14284e5c85b05ed9ef488a8af1746e486f"/>
+    <w:bookmarkEnd w:id="111"/>
+    <w:bookmarkStart w:id="113" w:name="X49b7f14284e5c85b05ed9ef488a8af1746e486f"/>
     <w:p>
       <w:pPr>
         <w:pStyle w:val="Bibliography"/>
@@ -4309,7 +4286,7 @@
       <w:r>
         <w:t xml:space="preserve"> </w:t>
       </w:r>
-      <w:hyperlink r:id="rId110">
+      <w:hyperlink r:id="rId112">
         <w:r>
           <w:rPr>
             <w:rStyle w:val="Hyperlink"/>
@@ -4321,13 +4298,75 @@
         <w:t xml:space="preserve">.</w:t>
       </w:r>
     </w:p>
-    <w:bookmarkEnd w:id="111"/>
-    <w:bookmarkStart w:id="112" w:name="ref-waltz_anthologie_1931"/>
+    <w:bookmarkEnd w:id="113"/>
+    <w:bookmarkStart w:id="114" w:name="X4b8cfb9b2c8e7a64a23dff41b9483b33706b8ab"/>
     <w:p>
       <w:pPr>
         <w:pStyle w:val="Bibliography"/>
       </w:pPr>
       <w:r>
+        <w:t xml:space="preserve">Vitali-Rosati, Marcello, Servanne Monjour, Joana Casenave, Elsa Bouchard, and Margot Mellet. 2020.</w:t>
+      </w:r>
+      <w:r>
+        <w:t xml:space="preserve"> </w:t>
+      </w:r>
+      <w:r>
+        <w:t xml:space="preserve">“Editorializing the</w:t>
+      </w:r>
+      <w:r>
+        <w:t xml:space="preserve"> </w:t>
+      </w:r>
+      <w:r>
+        <w:t xml:space="preserve">Greek Anthology</w:t>
+      </w:r>
+      <w:r>
+        <w:t xml:space="preserve">:</w:t>
+      </w:r>
+      <w:r>
+        <w:t xml:space="preserve"> </w:t>
+      </w:r>
+      <w:r>
+        <w:t xml:space="preserve">The Palatin Manuscript</w:t>
+      </w:r>
+      <w:r>
+        <w:t xml:space="preserve"> </w:t>
+      </w:r>
+      <w:r>
+        <w:t xml:space="preserve">as a</w:t>
+      </w:r>
+      <w:r>
+        <w:t xml:space="preserve"> </w:t>
+      </w:r>
+      <w:r>
+        <w:t xml:space="preserve">Collective Imaginary</w:t>
+      </w:r>
+      <w:r>
+        <w:t xml:space="preserve">.”</w:t>
+      </w:r>
+      <w:r>
+        <w:t xml:space="preserve"> </w:t>
+      </w:r>
+      <w:r>
+        <w:rPr>
+          <w:i/>
+          <w:iCs/>
+        </w:rPr>
+        <w:t xml:space="preserve">Digital Humanities Quarterly</w:t>
+      </w:r>
+      <w:r>
+        <w:t xml:space="preserve"> </w:t>
+      </w:r>
+      <w:r>
+        <w:t xml:space="preserve">14 (1).</w:t>
+      </w:r>
+    </w:p>
+    <w:bookmarkEnd w:id="114"/>
+    <w:bookmarkStart w:id="115" w:name="ref-waltz_anthologie_1931"/>
+    <w:p>
+      <w:pPr>
+        <w:pStyle w:val="Bibliography"/>
+      </w:pPr>
+      <w:r>
         <w:t xml:space="preserve">Waltz, Pierre. 1931.</w:t>
       </w:r>
       <w:r>
@@ -4344,8 +4383,8 @@
         <w:t xml:space="preserve">. Budé. Paris: Les Belles Lettres.</w:t>
       </w:r>
     </w:p>
-    <w:bookmarkEnd w:id="112"/>
-    <w:bookmarkStart w:id="113" w:name="ref-waltz_anthologie_1960"/>
+    <w:bookmarkEnd w:id="115"/>
+    <w:bookmarkStart w:id="116" w:name="ref-waltz_anthologie_1960"/>
     <w:p>
       <w:pPr>
         <w:pStyle w:val="Bibliography"/>
@@ -4367,8 +4406,8 @@
         <w:t xml:space="preserve">. Translated by Edouard Des Places, M. Dumitrescu, H. Le Maitre, and G. Soury. XIII vols. Budé. Paris: Les Belles Lettres.</w:t>
       </w:r>
     </w:p>
-    <w:bookmarkEnd w:id="113"/>
-    <w:bookmarkStart w:id="114" w:name="ref-waltz_anthologie_1974"/>
+    <w:bookmarkEnd w:id="116"/>
+    <w:bookmarkStart w:id="117" w:name="ref-waltz_anthologie_1974"/>
     <w:p>
       <w:pPr>
         <w:pStyle w:val="Bibliography"/>
@@ -4390,8 +4429,8 @@
         <w:t xml:space="preserve">. Edited by Jean Irigoin, Pierre Laurens, and G. Soury. XIII vols. Budé. Paris: Les Belles Lettres.</w:t>
       </w:r>
     </w:p>
-    <w:bookmarkEnd w:id="114"/>
-    <w:bookmarkStart w:id="115" w:name="ref-waltz_anthologie_2003"/>
+    <w:bookmarkEnd w:id="117"/>
+    <w:bookmarkStart w:id="118" w:name="ref-waltz_anthologie_2003"/>
     <w:p>
       <w:pPr>
         <w:pStyle w:val="Bibliography"/>
@@ -4413,8 +4452,8 @@
         <w:t xml:space="preserve">. Edited by Jean Irigoin. XIII vols. Budé. Paris: Les Belles Lettres.</w:t>
       </w:r>
     </w:p>
-    <w:bookmarkEnd w:id="115"/>
-    <w:bookmarkStart w:id="116" w:name="ref-waltz_anthologie_1929"/>
+    <w:bookmarkEnd w:id="118"/>
+    <w:bookmarkStart w:id="119" w:name="ref-waltz_anthologie_1929"/>
     <w:p>
       <w:pPr>
         <w:pStyle w:val="Bibliography"/>
@@ -4436,8 +4475,8 @@
         <w:t xml:space="preserve">. Vol. I–XIII. XIII vols. Budé. Paris: Les Belles Lettres.</w:t>
       </w:r>
     </w:p>
-    <w:bookmarkEnd w:id="116"/>
-    <w:bookmarkStart w:id="118" w:name="ref-zhaoSystematicReviewWikidata2023"/>
+    <w:bookmarkEnd w:id="119"/>
+    <w:bookmarkStart w:id="121" w:name="ref-zhaoSystematicReviewWikidata2023"/>
     <w:p>
       <w:pPr>
         <w:pStyle w:val="Bibliography"/>
@@ -4494,7 +4533,7 @@
       <w:r>
         <w:t xml:space="preserve"> </w:t>
       </w:r>
-      <w:hyperlink r:id="rId117">
+      <w:hyperlink r:id="rId120">
         <w:r>
           <w:rPr>
             <w:rStyle w:val="Hyperlink"/>
@@ -4506,9 +4545,9 @@
         <w:t xml:space="preserve">.</w:t>
       </w:r>
     </w:p>
-    <w:bookmarkEnd w:id="118"/>
-    <w:bookmarkEnd w:id="119"/>
-    <w:bookmarkEnd w:id="120"/>
+    <w:bookmarkEnd w:id="121"/>
+    <w:bookmarkEnd w:id="122"/>
+    <w:bookmarkEnd w:id="123"/>
     <w:sectPr/>
   </w:body>
 </w:document>

</xml_diff>